<commit_message>
feat(links): add verified companion asset quick-action toolbars and full Google Slides/Docs link suites across Blogs 1-5
</commit_message>
<xml_diff>
--- a/docs/word/ws5-decision-guide-and-agentic-triad.docx
+++ b/docs/word/ws5-decision-guide-and-agentic-triad.docx
@@ -9,7 +9,7 @@
         <w:keepLines w:val="1"/>
         <w:rPr/>
       </w:pPr>
-      <w:bookmarkStart w:colFirst="0" w:colLast="0" w:name="_8ngbd3ym1icw" w:id="0"/>
+      <w:bookmarkStart w:colFirst="0" w:colLast="0" w:name="_iu8tsl1ywlcp" w:id="0"/>
       <w:bookmarkEnd w:id="0"/>
       <w:r>
         <w:rPr>
@@ -529,13 +529,225 @@
         <w:shd w:fill="auto" w:val="clear"/>
         <w:rPr/>
       </w:pPr>
-      <w:bookmarkStart w:colFirst="0" w:colLast="0" w:name="_xtyfgf8rzltl" w:id="1"/>
+      <w:bookmarkStart w:colFirst="0" w:colLast="0" w:name="_cixbe0o53ywe" w:id="1"/>
       <w:bookmarkEnd w:id="1"/>
       <w:r>
         <w:rPr>
           <w:rtl w:val="0"/>
         </w:rPr>
         <w:t xml:space="preserve">Multi-tenant agentic AI system: Executive decision guide and the Multi-Tenant Agentic Triad</w:t>
+      </w:r>
+    </w:p>
+    <w:p>
+      <w:pPr>
+        <w:keepLines w:val="1"/>
+        <w:pBdr>
+          <w:top w:color="d2e3fc" w:space="6" w:sz="4" w:val="single"/>
+          <w:left w:color="1a73e8" w:space="8" w:sz="24" w:val="single"/>
+          <w:bottom w:color="d2e3fc" w:space="6" w:sz="4" w:val="single"/>
+          <w:right w:color="d2e3fc" w:space="6" w:sz="4" w:val="single"/>
+        </w:pBdr>
+        <w:shd w:fill="e8f0fe" w:val="clear"/>
+        <w:spacing w:after="160" w:before="120" w:lineRule="auto"/>
+        <w:ind w:left="240" w:right="240" w:firstLine="0"/>
+        <w:rPr/>
+      </w:pPr>
+      <w:r>
+        <w:rPr>
+          <w:b w:val="1"/>
+          <w:bCs w:val="1"/>
+          <w:color w:val="174ea6"/>
+          <w:rtl w:val="0"/>
+        </w:rPr>
+        <w:t xml:space="preserve">Note: </w:t>
+      </w:r>
+      <w:r>
+        <w:rPr>
+          <w:b w:val="1"/>
+          <w:bCs w:val="1"/>
+          <w:rtl w:val="0"/>
+        </w:rPr>
+        <w:t xml:space="preserve">Companion Cloud Architecture Assets:</w:t>
+      </w:r>
+      <w:r>
+        <w:rPr>
+          <w:rtl w:val="0"/>
+        </w:rPr>
+        <w:br w:type="textWrapping"/>
+      </w:r>
+      <w:r>
+        <w:rPr>
+          <w:rtl w:val="0"/>
+        </w:rPr>
+        <w:t xml:space="preserve">• 📊 </w:t>
+      </w:r>
+      <w:r>
+        <w:rPr>
+          <w:b w:val="1"/>
+          <w:bCs w:val="1"/>
+          <w:rtl w:val="0"/>
+        </w:rPr>
+        <w:t xml:space="preserve">Google Slides</w:t>
+      </w:r>
+      <w:r>
+        <w:rPr>
+          <w:rtl w:val="0"/>
+        </w:rPr>
+        <w:t xml:space="preserve">: </w:t>
+      </w:r>
+      <w:hyperlink r:id="rId10">
+        <w:r>
+          <w:rPr>
+            <w:rFonts w:ascii="Arial Unicode MS" w:cs="Arial Unicode MS" w:eastAsia="Arial Unicode MS" w:hAnsi="Arial Unicode MS"/>
+            <w:color w:val="1155cc"/>
+            <w:u w:val="single"/>
+            <w:rtl w:val="0"/>
+          </w:rPr>
+          <w:t xml:space="preserve">Open WS5 12-Slide Canonical Deck (Google Slides ↗)</w:t>
+        </w:r>
+      </w:hyperlink>
+      <w:r>
+        <w:rPr>
+          <w:rtl w:val="0"/>
+        </w:rPr>
+        <w:t xml:space="preserve"> • </w:t>
+      </w:r>
+      <w:hyperlink r:id="rId11">
+        <w:r>
+          <w:rPr>
+            <w:rFonts w:ascii="Arial Unicode MS" w:cs="Arial Unicode MS" w:eastAsia="Arial Unicode MS" w:hAnsi="Arial Unicode MS"/>
+            <w:color w:val="1155cc"/>
+            <w:u w:val="single"/>
+            <w:rtl w:val="0"/>
+          </w:rPr>
+          <w:t xml:space="preserve">Open Master 25-Slide Presentation (Google Slides ↗)</w:t>
+        </w:r>
+      </w:hyperlink>
+      <w:r>
+        <w:rPr>
+          <w:rtl w:val="0"/>
+        </w:rPr>
+        <w:t xml:space="preserve"> • </w:t>
+      </w:r>
+      <w:hyperlink r:id="rId12">
+        <w:r>
+          <w:rPr>
+            <w:color w:val="1155cc"/>
+            <w:u w:val="single"/>
+            <w:rtl w:val="0"/>
+          </w:rPr>
+          <w:t xml:space="preserve">Download 12-Slide Canonical (.pptx)</w:t>
+        </w:r>
+      </w:hyperlink>
+      <w:r>
+        <w:rPr>
+          <w:rtl w:val="0"/>
+        </w:rPr>
+        <w:t xml:space="preserve"> • </w:t>
+      </w:r>
+      <w:hyperlink r:id="rId13">
+        <w:r>
+          <w:rPr>
+            <w:color w:val="1155cc"/>
+            <w:u w:val="single"/>
+            <w:rtl w:val="0"/>
+          </w:rPr>
+          <w:t xml:space="preserve">Download Master 25-Slide (.pptx)</w:t>
+        </w:r>
+      </w:hyperlink>
+      <w:r>
+        <w:rPr>
+          <w:rtl w:val="0"/>
+        </w:rPr>
+        <w:br w:type="textWrapping"/>
+      </w:r>
+      <w:r>
+        <w:rPr>
+          <w:rtl w:val="0"/>
+        </w:rPr>
+        <w:t xml:space="preserve">• 📄 </w:t>
+      </w:r>
+      <w:r>
+        <w:rPr>
+          <w:b w:val="1"/>
+          <w:bCs w:val="1"/>
+          <w:rtl w:val="0"/>
+        </w:rPr>
+        <w:t xml:space="preserve">Google Docs &amp; Word</w:t>
+      </w:r>
+      <w:r>
+        <w:rPr>
+          <w:rtl w:val="0"/>
+        </w:rPr>
+        <w:t xml:space="preserve">: </w:t>
+      </w:r>
+      <w:hyperlink r:id="rId14">
+        <w:r>
+          <w:rPr>
+            <w:rFonts w:ascii="Arial Unicode MS" w:cs="Arial Unicode MS" w:eastAsia="Arial Unicode MS" w:hAnsi="Arial Unicode MS"/>
+            <w:color w:val="1155cc"/>
+            <w:u w:val="single"/>
+            <w:rtl w:val="0"/>
+          </w:rPr>
+          <w:t xml:space="preserve">Open WS5 GCP-Branded Google Doc ↗</w:t>
+        </w:r>
+      </w:hyperlink>
+      <w:r>
+        <w:rPr>
+          <w:rtl w:val="0"/>
+        </w:rPr>
+        <w:t xml:space="preserve"> • </w:t>
+      </w:r>
+      <w:hyperlink r:id="rId15">
+        <w:r>
+          <w:rPr>
+            <w:color w:val="1155cc"/>
+            <w:u w:val="single"/>
+            <w:rtl w:val="0"/>
+          </w:rPr>
+          <w:t xml:space="preserve">Download Microsoft Word (.docx)</w:t>
+        </w:r>
+      </w:hyperlink>
+      <w:r>
+        <w:rPr>
+          <w:rtl w:val="0"/>
+        </w:rPr>
+        <w:br w:type="textWrapping"/>
+      </w:r>
+      <w:r>
+        <w:rPr>
+          <w:rtl w:val="0"/>
+        </w:rPr>
+        <w:t xml:space="preserve">• 📐 </w:t>
+      </w:r>
+      <w:r>
+        <w:rPr>
+          <w:b w:val="1"/>
+          <w:bCs w:val="1"/>
+          <w:rtl w:val="0"/>
+        </w:rPr>
+        <w:t xml:space="preserve">Official Draw.io Blueprints</w:t>
+      </w:r>
+      <w:r>
+        <w:rPr>
+          <w:rtl w:val="0"/>
+        </w:rPr>
+        <w:t xml:space="preserve">: </w:t>
+      </w:r>
+      <w:hyperlink r:id="rId16">
+        <w:r>
+          <w:rPr>
+            <w:color w:val="1155cc"/>
+            <w:u w:val="single"/>
+            <w:rtl w:val="0"/>
+          </w:rPr>
+          <w:t xml:space="preserve">Figure 1 Decision Tree &amp; Agentic Triad (.drawio)</w:t>
+        </w:r>
+      </w:hyperlink>
+      <w:r>
+        <w:rPr>
+          <w:rtl w:val="0"/>
+        </w:rPr>
       </w:r>
     </w:p>
     <w:p>
@@ -549,7 +761,7 @@
         </w:rPr>
         <w:t xml:space="preserve">This document provides an executive decision framework to help you select, combine, and operate the right multi-tenant isolation topology for agentic AI systems on Google Cloud. It synthesizes the architectural patterns, security verification suites, and FinOps benchmarks from across this 5-part series—</w:t>
       </w:r>
-      <w:hyperlink r:id="rId10">
+      <w:hyperlink r:id="rId17">
         <w:r>
           <w:rPr>
             <w:color w:val="1155cc"/>
@@ -565,7 +777,7 @@
         </w:rPr>
         <w:t xml:space="preserve">, </w:t>
       </w:r>
-      <w:hyperlink r:id="rId11">
+      <w:hyperlink r:id="rId18">
         <w:r>
           <w:rPr>
             <w:color w:val="1155cc"/>
@@ -581,7 +793,7 @@
         </w:rPr>
         <w:t xml:space="preserve">, </w:t>
       </w:r>
-      <w:hyperlink r:id="rId12">
+      <w:hyperlink r:id="rId19">
         <w:r>
           <w:rPr>
             <w:color w:val="1155cc"/>
@@ -597,7 +809,7 @@
         </w:rPr>
         <w:t xml:space="preserve">, and </w:t>
       </w:r>
-      <w:hyperlink r:id="rId13">
+      <w:hyperlink r:id="rId20">
         <w:r>
           <w:rPr>
             <w:color w:val="1155cc"/>
@@ -639,7 +851,7 @@
         </w:rPr>
         <w:t xml:space="preserve">This document is intended for CTOs, principal cloud architects, CISOs, and AI product leaders evaluating </w:t>
       </w:r>
-      <w:hyperlink r:id="rId14">
+      <w:hyperlink r:id="rId21">
         <w:r>
           <w:rPr>
             <w:color w:val="1155cc"/>
@@ -655,7 +867,7 @@
         </w:rPr>
         <w:t xml:space="preserve"> and </w:t>
       </w:r>
-      <w:hyperlink r:id="rId15">
+      <w:hyperlink r:id="rId22">
         <w:r>
           <w:rPr>
             <w:color w:val="1155cc"/>
@@ -779,7 +991,7 @@
         <w:keepLines w:val="1"/>
         <w:rPr/>
       </w:pPr>
-      <w:bookmarkStart w:colFirst="0" w:colLast="0" w:name="_1p0k3lpgp567" w:id="2"/>
+      <w:bookmarkStart w:colFirst="0" w:colLast="0" w:name="_vt465bfts84u" w:id="2"/>
       <w:bookmarkEnd w:id="2"/>
       <w:r>
         <w:rPr>
@@ -887,7 +1099,7 @@
         </w:rPr>
         <w:t xml:space="preserve">—across the four foundational series primitives (</w:t>
       </w:r>
-      <w:hyperlink r:id="rId16">
+      <w:hyperlink r:id="rId23">
         <w:r>
           <w:rPr>
             <w:color w:val="1155cc"/>
@@ -922,7 +1134,7 @@
       <w:pPr>
         <w:numPr>
           <w:ilvl w:val="0"/>
-          <w:numId w:val="6"/>
+          <w:numId w:val="2"/>
         </w:numPr>
         <w:spacing w:after="0" w:afterAutospacing="0" w:lineRule="auto"/>
         <w:ind w:left="720" w:hanging="360"/>
@@ -962,7 +1174,7 @@
         </w:rPr>
         <w:t xml:space="preserve"> The invariant 80% reusable Python agent runtime (</w:t>
       </w:r>
-      <w:hyperlink r:id="rId17">
+      <w:hyperlink r:id="rId24">
         <w:r>
           <w:rPr>
             <w:rFonts w:ascii="Roboto Mono" w:cs="Roboto Mono" w:eastAsia="Roboto Mono" w:hAnsi="Roboto Mono"/>
@@ -984,7 +1196,7 @@
       <w:pPr>
         <w:numPr>
           <w:ilvl w:val="0"/>
-          <w:numId w:val="6"/>
+          <w:numId w:val="2"/>
         </w:numPr>
         <w:spacing w:after="0" w:afterAutospacing="0" w:lineRule="auto"/>
         <w:ind w:left="720" w:hanging="360"/>
@@ -1024,7 +1236,7 @@
         </w:rPr>
         <w:t xml:space="preserve"> The Hop 2 Discovery Engine catalog Policy Decision Point (</w:t>
       </w:r>
-      <w:hyperlink r:id="rId18">
+      <w:hyperlink r:id="rId25">
         <w:r>
           <w:rPr>
             <w:rFonts w:ascii="Roboto Mono" w:cs="Roboto Mono" w:eastAsia="Roboto Mono" w:hAnsi="Roboto Mono"/>
@@ -1060,7 +1272,7 @@
       <w:pPr>
         <w:numPr>
           <w:ilvl w:val="0"/>
-          <w:numId w:val="6"/>
+          <w:numId w:val="2"/>
         </w:numPr>
         <w:spacing w:after="0" w:afterAutospacing="0" w:lineRule="auto"/>
         <w:ind w:left="720" w:hanging="360"/>
@@ -1114,7 +1326,7 @@
         </w:rPr>
         <w:t xml:space="preserve"> DPoP-bound 3LO OAuth tokens and live AWS Bedrock AgentCore federation across 10 enterprise SaaS platforms (</w:t>
       </w:r>
-      <w:hyperlink r:id="rId19">
+      <w:hyperlink r:id="rId26">
         <w:r>
           <w:rPr>
             <w:rFonts w:ascii="Roboto Mono" w:cs="Roboto Mono" w:eastAsia="Roboto Mono" w:hAnsi="Roboto Mono"/>
@@ -1136,7 +1348,7 @@
       <w:pPr>
         <w:numPr>
           <w:ilvl w:val="0"/>
-          <w:numId w:val="6"/>
+          <w:numId w:val="2"/>
         </w:numPr>
         <w:spacing w:after="200" w:lineRule="auto"/>
         <w:ind w:left="720" w:hanging="360"/>
@@ -1962,7 +2174,7 @@
                 <w:szCs w:val="19"/>
               </w:rPr>
             </w:pPr>
-            <w:hyperlink r:id="rId20">
+            <w:hyperlink r:id="rId27">
               <w:r>
                 <w:rPr>
                   <w:rFonts w:ascii="Roboto Mono" w:cs="Roboto Mono" w:eastAsia="Roboto Mono" w:hAnsi="Roboto Mono"/>
@@ -2292,7 +2504,7 @@
                 <w:szCs w:val="19"/>
               </w:rPr>
             </w:pPr>
-            <w:hyperlink r:id="rId21">
+            <w:hyperlink r:id="rId28">
               <w:r>
                 <w:rPr>
                   <w:rFonts w:ascii="Roboto Mono" w:cs="Roboto Mono" w:eastAsia="Roboto Mono" w:hAnsi="Roboto Mono"/>
@@ -2662,7 +2874,7 @@
                 <w:szCs w:val="19"/>
               </w:rPr>
             </w:pPr>
-            <w:hyperlink r:id="rId22">
+            <w:hyperlink r:id="rId29">
               <w:r>
                 <w:rPr>
                   <w:rFonts w:ascii="Roboto Mono" w:cs="Roboto Mono" w:eastAsia="Roboto Mono" w:hAnsi="Roboto Mono"/>
@@ -2961,7 +3173,7 @@
                 <w:szCs w:val="19"/>
               </w:rPr>
             </w:pPr>
-            <w:hyperlink r:id="rId23">
+            <w:hyperlink r:id="rId30">
               <w:r>
                 <w:rPr>
                   <w:rFonts w:ascii="Roboto Mono" w:cs="Roboto Mono" w:eastAsia="Roboto Mono" w:hAnsi="Roboto Mono"/>
@@ -3202,7 +3414,7 @@
                 <w:szCs w:val="19"/>
               </w:rPr>
             </w:pPr>
-            <w:hyperlink r:id="rId24">
+            <w:hyperlink r:id="rId31">
               <w:r>
                 <w:rPr>
                   <w:rFonts w:ascii="Roboto Mono" w:cs="Roboto Mono" w:eastAsia="Roboto Mono" w:hAnsi="Roboto Mono"/>
@@ -3233,7 +3445,7 @@
         <w:spacing w:before="360" w:lineRule="auto"/>
         <w:rPr/>
       </w:pPr>
-      <w:bookmarkStart w:colFirst="0" w:colLast="0" w:name="_utbbyojoupzk" w:id="3"/>
+      <w:bookmarkStart w:colFirst="0" w:colLast="0" w:name="_r9cprs6h37uf" w:id="3"/>
       <w:bookmarkEnd w:id="3"/>
       <w:r>
         <w:rPr>
@@ -3253,7 +3465,7 @@
         </w:rPr>
         <w:t xml:space="preserve">Use the following decision rules (</w:t>
       </w:r>
-      <w:hyperlink r:id="rId25">
+      <w:hyperlink r:id="rId32">
         <w:r>
           <w:rPr>
             <w:color w:val="1155cc"/>
@@ -3274,7 +3486,7 @@
       <w:pPr>
         <w:numPr>
           <w:ilvl w:val="0"/>
-          <w:numId w:val="10"/>
+          <w:numId w:val="7"/>
         </w:numPr>
         <w:spacing w:after="0" w:afterAutospacing="0" w:lineRule="auto"/>
         <w:ind w:left="720" w:hanging="360"/>
@@ -3315,7 +3527,7 @@
       <w:pPr>
         <w:numPr>
           <w:ilvl w:val="0"/>
-          <w:numId w:val="10"/>
+          <w:numId w:val="7"/>
         </w:numPr>
         <w:spacing w:after="0" w:afterAutospacing="0" w:lineRule="auto"/>
         <w:ind w:left="720" w:hanging="360"/>
@@ -3342,7 +3554,7 @@
       <w:pPr>
         <w:numPr>
           <w:ilvl w:val="0"/>
-          <w:numId w:val="10"/>
+          <w:numId w:val="7"/>
         </w:numPr>
         <w:spacing w:after="200" w:lineRule="auto"/>
         <w:ind w:left="720" w:hanging="360"/>
@@ -3372,7 +3584,7 @@
         <w:keepLines w:val="1"/>
         <w:rPr/>
       </w:pPr>
-      <w:bookmarkStart w:colFirst="0" w:colLast="0" w:name="_wjj12k9gtjjz" w:id="4"/>
+      <w:bookmarkStart w:colFirst="0" w:colLast="0" w:name="_au4b2iu49jqj" w:id="4"/>
       <w:bookmarkEnd w:id="4"/>
       <w:r>
         <w:rPr>
@@ -3388,7 +3600,7 @@
         <w:keepLines w:val="1"/>
         <w:rPr/>
       </w:pPr>
-      <w:bookmarkStart w:colFirst="0" w:colLast="0" w:name="_2k6zzwfabxbe" w:id="5"/>
+      <w:bookmarkStart w:colFirst="0" w:colLast="0" w:name="_u5l07zi8bnr2" w:id="5"/>
       <w:bookmarkEnd w:id="5"/>
       <w:r>
         <w:rPr>
@@ -3563,7 +3775,7 @@
               </w:rPr>
               <w:t xml:space="preserve">Pattern A: Pooled (</w:t>
             </w:r>
-            <w:hyperlink r:id="rId26">
+            <w:hyperlink r:id="rId33">
               <w:r>
                 <w:rPr>
                   <w:b w:val="1"/>
@@ -3641,7 +3853,7 @@
               </w:rPr>
               <w:t xml:space="preserve">Pattern B: Sovereign Silos (</w:t>
             </w:r>
-            <w:hyperlink r:id="rId27">
+            <w:hyperlink r:id="rId34">
               <w:r>
                 <w:rPr>
                   <w:b w:val="1"/>
@@ -3719,7 +3931,7 @@
               </w:rPr>
               <w:t xml:space="preserve">Pattern C: Dynamic Hybrid (</w:t>
             </w:r>
-            <w:hyperlink r:id="rId28">
+            <w:hyperlink r:id="rId35">
               <w:r>
                 <w:rPr>
                   <w:b w:val="1"/>
@@ -5937,7 +6149,7 @@
         <w:spacing w:before="360" w:lineRule="auto"/>
         <w:rPr/>
       </w:pPr>
-      <w:bookmarkStart w:colFirst="0" w:colLast="0" w:name="_yqf9jefcvuhd" w:id="6"/>
+      <w:bookmarkStart w:colFirst="0" w:colLast="0" w:name="_pll94eq0xn2s" w:id="6"/>
       <w:bookmarkEnd w:id="6"/>
       <w:r>
         <w:rPr>
@@ -5957,7 +6169,7 @@
         </w:rPr>
         <w:t xml:space="preserve">Regardless of which topology you select, the same five governance modules in </w:t>
       </w:r>
-      <w:hyperlink r:id="rId29">
+      <w:hyperlink r:id="rId36">
         <w:r>
           <w:rPr>
             <w:rFonts w:ascii="Roboto Mono" w:cs="Roboto Mono" w:eastAsia="Roboto Mono" w:hAnsi="Roboto Mono"/>
@@ -6277,7 +6489,7 @@
                 <w:szCs w:val="19"/>
               </w:rPr>
             </w:pPr>
-            <w:hyperlink r:id="rId30">
+            <w:hyperlink r:id="rId37">
               <w:r>
                 <w:rPr>
                   <w:rFonts w:ascii="Roboto Mono" w:cs="Roboto Mono" w:eastAsia="Roboto Mono" w:hAnsi="Roboto Mono"/>
@@ -6469,7 +6681,7 @@
                 <w:szCs w:val="19"/>
               </w:rPr>
             </w:pPr>
-            <w:hyperlink r:id="rId31">
+            <w:hyperlink r:id="rId38">
               <w:r>
                 <w:rPr>
                   <w:rFonts w:ascii="Roboto Mono" w:cs="Roboto Mono" w:eastAsia="Roboto Mono" w:hAnsi="Roboto Mono"/>
@@ -6685,7 +6897,7 @@
                 <w:szCs w:val="19"/>
               </w:rPr>
             </w:pPr>
-            <w:hyperlink r:id="rId32">
+            <w:hyperlink r:id="rId39">
               <w:r>
                 <w:rPr>
                   <w:rFonts w:ascii="Roboto Mono" w:cs="Roboto Mono" w:eastAsia="Roboto Mono" w:hAnsi="Roboto Mono"/>
@@ -6937,7 +7149,7 @@
                 <w:szCs w:val="19"/>
               </w:rPr>
             </w:pPr>
-            <w:hyperlink r:id="rId33">
+            <w:hyperlink r:id="rId40">
               <w:r>
                 <w:rPr>
                   <w:rFonts w:ascii="Roboto Mono" w:cs="Roboto Mono" w:eastAsia="Roboto Mono" w:hAnsi="Roboto Mono"/>
@@ -7153,7 +7365,7 @@
                 <w:szCs w:val="19"/>
               </w:rPr>
             </w:pPr>
-            <w:hyperlink r:id="rId34">
+            <w:hyperlink r:id="rId41">
               <w:r>
                 <w:rPr>
                   <w:rFonts w:ascii="Roboto Mono" w:cs="Roboto Mono" w:eastAsia="Roboto Mono" w:hAnsi="Roboto Mono"/>
@@ -7267,7 +7479,7 @@
         <w:spacing w:before="360" w:lineRule="auto"/>
         <w:rPr/>
       </w:pPr>
-      <w:bookmarkStart w:colFirst="0" w:colLast="0" w:name="_dlau2qwpsuso" w:id="7"/>
+      <w:bookmarkStart w:colFirst="0" w:colLast="0" w:name="_9xafp62p8875" w:id="7"/>
       <w:bookmarkEnd w:id="7"/>
       <w:r>
         <w:rPr>
@@ -7316,16 +7528,16 @@
           <wp:inline distB="114300" distT="114300" distL="114300" distR="114300">
             <wp:extent cx="6731000" cy="7905563"/>
             <wp:effectExtent b="0" l="0" r="0" t="0"/>
-            <wp:docPr id="7" name="image7.png"/>
+            <wp:docPr id="2" name="image6.png"/>
             <a:graphic>
               <a:graphicData uri="http://schemas.openxmlformats.org/drawingml/2006/picture">
                 <pic:pic>
                   <pic:nvPicPr>
-                    <pic:cNvPr id="0" name="image7.png"/>
+                    <pic:cNvPr id="0" name="image6.png"/>
                     <pic:cNvPicPr preferRelativeResize="0"/>
                   </pic:nvPicPr>
                   <pic:blipFill>
-                    <a:blip r:embed="rId35"/>
+                    <a:blip r:embed="rId42"/>
                     <a:srcRect b="0" l="0" r="0" t="0"/>
                     <a:stretch>
                       <a:fillRect/>
@@ -7457,7 +7669,7 @@
         </w:rPr>
         <w:t xml:space="preserve">, Step 6). Editable assets: </w:t>
       </w:r>
-      <w:hyperlink r:id="rId36">
+      <w:hyperlink r:id="rId43">
         <w:r>
           <w:rPr>
             <w:i w:val="1"/>
@@ -7477,7 +7689,7 @@
         </w:rPr>
         <w:t xml:space="preserve"> | </w:t>
       </w:r>
-      <w:hyperlink r:id="rId37">
+      <w:hyperlink r:id="rId44">
         <w:r>
           <w:rPr>
             <w:i w:val="1"/>
@@ -7497,7 +7709,7 @@
         </w:rPr>
         <w:t xml:space="preserve"> | </w:t>
       </w:r>
-      <w:hyperlink r:id="rId38">
+      <w:hyperlink r:id="rId45">
         <w:r>
           <w:rPr>
             <w:i w:val="1"/>
@@ -7517,7 +7729,7 @@
         </w:rPr>
         <w:t xml:space="preserve"> | </w:t>
       </w:r>
-      <w:hyperlink r:id="rId39">
+      <w:hyperlink r:id="rId46">
         <w:r>
           <w:rPr>
             <w:i w:val="1"/>
@@ -7563,7 +7775,7 @@
         </w:rPr>
         <w:t xml:space="preserve">, and the three side-by-side Pattern Outcome Columns (</w:t>
       </w:r>
-      <w:hyperlink r:id="rId40">
+      <w:hyperlink r:id="rId47">
         <w:r>
           <w:rPr>
             <w:color w:val="1155cc"/>
@@ -7584,7 +7796,7 @@
       <w:pPr>
         <w:numPr>
           <w:ilvl w:val="0"/>
-          <w:numId w:val="11"/>
+          <w:numId w:val="3"/>
         </w:numPr>
         <w:spacing w:after="0" w:afterAutospacing="0" w:lineRule="auto"/>
         <w:ind w:left="720" w:hanging="360"/>
@@ -7713,7 +7925,7 @@
       <w:pPr>
         <w:numPr>
           <w:ilvl w:val="0"/>
-          <w:numId w:val="11"/>
+          <w:numId w:val="3"/>
         </w:numPr>
         <w:spacing w:after="0" w:afterAutospacing="0" w:lineRule="auto"/>
         <w:ind w:left="720" w:hanging="360"/>
@@ -7870,7 +8082,7 @@
       <w:pPr>
         <w:numPr>
           <w:ilvl w:val="0"/>
-          <w:numId w:val="11"/>
+          <w:numId w:val="3"/>
         </w:numPr>
         <w:spacing w:after="0" w:afterAutospacing="0" w:lineRule="auto"/>
         <w:ind w:left="720" w:hanging="360"/>
@@ -7985,7 +8197,7 @@
       <w:pPr>
         <w:numPr>
           <w:ilvl w:val="0"/>
-          <w:numId w:val="11"/>
+          <w:numId w:val="3"/>
         </w:numPr>
         <w:spacing w:after="0" w:afterAutospacing="0" w:lineRule="auto"/>
         <w:ind w:left="720" w:hanging="360"/>
@@ -8100,7 +8312,7 @@
       <w:pPr>
         <w:numPr>
           <w:ilvl w:val="0"/>
-          <w:numId w:val="11"/>
+          <w:numId w:val="3"/>
         </w:numPr>
         <w:spacing w:after="200" w:lineRule="auto"/>
         <w:ind w:left="720" w:hanging="360"/>
@@ -8390,7 +8602,7 @@
         </w:rPr>
         <w:t xml:space="preserve"> in </w:t>
       </w:r>
-      <w:hyperlink r:id="rId41">
+      <w:hyperlink r:id="rId48">
         <w:r>
           <w:rPr>
             <w:rFonts w:ascii="Roboto Mono" w:cs="Roboto Mono" w:eastAsia="Roboto Mono" w:hAnsi="Roboto Mono"/>
@@ -8412,7 +8624,7 @@
       <w:pPr>
         <w:numPr>
           <w:ilvl w:val="0"/>
-          <w:numId w:val="17"/>
+          <w:numId w:val="14"/>
         </w:numPr>
         <w:spacing w:after="0" w:afterAutospacing="0" w:lineRule="auto"/>
         <w:ind w:left="720" w:hanging="360"/>
@@ -8470,7 +8682,7 @@
         </w:rPr>
         <w:t xml:space="preserve"> Evaluate the SaaS product's regulatory surface area, customer contract mandates, and pricing tier packaging (</w:t>
       </w:r>
-      <w:hyperlink r:id="rId42">
+      <w:hyperlink r:id="rId49">
         <w:r>
           <w:rPr>
             <w:rFonts w:ascii="Roboto Mono" w:cs="Roboto Mono" w:eastAsia="Roboto Mono" w:hAnsi="Roboto Mono"/>
@@ -8506,7 +8718,7 @@
       <w:pPr>
         <w:numPr>
           <w:ilvl w:val="0"/>
-          <w:numId w:val="17"/>
+          <w:numId w:val="14"/>
         </w:numPr>
         <w:spacing w:after="0" w:afterAutospacing="0" w:lineRule="auto"/>
         <w:ind w:left="720" w:hanging="360"/>
@@ -8667,7 +8879,7 @@
       <w:pPr>
         <w:numPr>
           <w:ilvl w:val="0"/>
-          <w:numId w:val="17"/>
+          <w:numId w:val="14"/>
         </w:numPr>
         <w:spacing w:after="0" w:afterAutospacing="0" w:lineRule="auto"/>
         <w:ind w:left="720" w:hanging="360"/>
@@ -8828,7 +9040,7 @@
       <w:pPr>
         <w:numPr>
           <w:ilvl w:val="0"/>
-          <w:numId w:val="17"/>
+          <w:numId w:val="14"/>
         </w:numPr>
         <w:spacing w:after="0" w:afterAutospacing="0" w:lineRule="auto"/>
         <w:ind w:left="720" w:hanging="360"/>
@@ -8942,7 +9154,7 @@
         </w:rPr>
         <w:t xml:space="preserve">) via </w:t>
       </w:r>
-      <w:hyperlink r:id="rId43">
+      <w:hyperlink r:id="rId50">
         <w:r>
           <w:rPr>
             <w:rFonts w:ascii="Roboto Mono" w:cs="Roboto Mono" w:eastAsia="Roboto Mono" w:hAnsi="Roboto Mono"/>
@@ -8978,7 +9190,7 @@
       <w:pPr>
         <w:numPr>
           <w:ilvl w:val="0"/>
-          <w:numId w:val="17"/>
+          <w:numId w:val="14"/>
         </w:numPr>
         <w:spacing w:after="0" w:afterAutospacing="0" w:lineRule="auto"/>
         <w:ind w:left="720" w:hanging="360"/>
@@ -9092,7 +9304,7 @@
         </w:rPr>
         <w:t xml:space="preserve">) via </w:t>
       </w:r>
-      <w:hyperlink r:id="rId44">
+      <w:hyperlink r:id="rId51">
         <w:r>
           <w:rPr>
             <w:rFonts w:ascii="Roboto Mono" w:cs="Roboto Mono" w:eastAsia="Roboto Mono" w:hAnsi="Roboto Mono"/>
@@ -9128,7 +9340,7 @@
       <w:pPr>
         <w:numPr>
           <w:ilvl w:val="0"/>
-          <w:numId w:val="17"/>
+          <w:numId w:val="14"/>
         </w:numPr>
         <w:spacing w:after="0" w:afterAutospacing="0" w:lineRule="auto"/>
         <w:ind w:left="720" w:hanging="360"/>
@@ -9242,7 +9454,7 @@
         </w:rPr>
         <w:t xml:space="preserve">) via </w:t>
       </w:r>
-      <w:hyperlink r:id="rId45">
+      <w:hyperlink r:id="rId52">
         <w:r>
           <w:rPr>
             <w:rFonts w:ascii="Roboto Mono" w:cs="Roboto Mono" w:eastAsia="Roboto Mono" w:hAnsi="Roboto Mono"/>
@@ -9278,7 +9490,7 @@
       <w:pPr>
         <w:numPr>
           <w:ilvl w:val="0"/>
-          <w:numId w:val="17"/>
+          <w:numId w:val="14"/>
         </w:numPr>
         <w:spacing w:after="200" w:lineRule="auto"/>
         <w:ind w:left="720" w:hanging="360"/>
@@ -9350,7 +9562,7 @@
         </w:rPr>
         <w:t xml:space="preserve"> (</w:t>
       </w:r>
-      <w:hyperlink r:id="rId46">
+      <w:hyperlink r:id="rId53">
         <w:r>
           <w:rPr>
             <w:rFonts w:ascii="Roboto Mono" w:cs="Roboto Mono" w:eastAsia="Roboto Mono" w:hAnsi="Roboto Mono"/>
@@ -9431,7 +9643,7 @@
         <w:keepLines w:val="1"/>
         <w:rPr/>
       </w:pPr>
-      <w:bookmarkStart w:colFirst="0" w:colLast="0" w:name="_wnc0kjlz74bx" w:id="8"/>
+      <w:bookmarkStart w:colFirst="0" w:colLast="0" w:name="_nlul2bhhalfa" w:id="8"/>
       <w:bookmarkEnd w:id="8"/>
       <w:r>
         <w:rPr>
@@ -9461,7 +9673,7 @@
           <w:vertAlign w:val="baseline"/>
         </w:rPr>
       </w:pPr>
-      <w:bookmarkStart w:colFirst="0" w:colLast="0" w:name="_55s5cnt0qa2u" w:id="9"/>
+      <w:bookmarkStart w:colFirst="0" w:colLast="0" w:name="_8n0xc4aywea5" w:id="9"/>
       <w:bookmarkEnd w:id="9"/>
       <w:r>
         <w:rPr>
@@ -9475,7 +9687,7 @@
       <w:pPr>
         <w:numPr>
           <w:ilvl w:val="0"/>
-          <w:numId w:val="5"/>
+          <w:numId w:val="16"/>
         </w:numPr>
         <w:spacing w:after="0" w:afterAutospacing="0" w:lineRule="auto"/>
         <w:ind w:left="720" w:hanging="360"/>
@@ -9484,7 +9696,7 @@
           <w:vertAlign w:val="baseline"/>
         </w:rPr>
       </w:pPr>
-      <w:hyperlink r:id="rId47">
+      <w:hyperlink r:id="rId54">
         <w:r>
           <w:rPr>
             <w:color w:val="1155cc"/>
@@ -9507,7 +9719,7 @@
       <w:pPr>
         <w:numPr>
           <w:ilvl w:val="0"/>
-          <w:numId w:val="5"/>
+          <w:numId w:val="16"/>
         </w:numPr>
         <w:spacing w:after="0" w:afterAutospacing="0" w:lineRule="auto"/>
         <w:ind w:left="720" w:hanging="360"/>
@@ -9516,7 +9728,7 @@
           <w:vertAlign w:val="baseline"/>
         </w:rPr>
       </w:pPr>
-      <w:hyperlink r:id="rId48">
+      <w:hyperlink r:id="rId55">
         <w:r>
           <w:rPr>
             <w:color w:val="1155cc"/>
@@ -9587,7 +9799,7 @@
       <w:pPr>
         <w:numPr>
           <w:ilvl w:val="0"/>
-          <w:numId w:val="5"/>
+          <w:numId w:val="16"/>
         </w:numPr>
         <w:spacing w:after="0" w:afterAutospacing="0" w:lineRule="auto"/>
         <w:ind w:left="720" w:hanging="360"/>
@@ -9596,7 +9808,7 @@
           <w:vertAlign w:val="baseline"/>
         </w:rPr>
       </w:pPr>
-      <w:hyperlink r:id="rId49">
+      <w:hyperlink r:id="rId56">
         <w:r>
           <w:rPr>
             <w:color w:val="1155cc"/>
@@ -9651,7 +9863,7 @@
       <w:pPr>
         <w:numPr>
           <w:ilvl w:val="0"/>
-          <w:numId w:val="5"/>
+          <w:numId w:val="16"/>
         </w:numPr>
         <w:spacing w:after="0" w:afterAutospacing="0" w:lineRule="auto"/>
         <w:ind w:left="720" w:hanging="360"/>
@@ -9660,7 +9872,7 @@
           <w:vertAlign w:val="baseline"/>
         </w:rPr>
       </w:pPr>
-      <w:hyperlink r:id="rId50">
+      <w:hyperlink r:id="rId57">
         <w:r>
           <w:rPr>
             <w:color w:val="1155cc"/>
@@ -9699,7 +9911,7 @@
       <w:pPr>
         <w:numPr>
           <w:ilvl w:val="0"/>
-          <w:numId w:val="5"/>
+          <w:numId w:val="16"/>
         </w:numPr>
         <w:spacing w:after="200" w:lineRule="auto"/>
         <w:ind w:left="720" w:hanging="360"/>
@@ -9707,7 +9919,7 @@
           <w:u w:val="none"/>
         </w:rPr>
       </w:pPr>
-      <w:hyperlink r:id="rId51">
+      <w:hyperlink r:id="rId58">
         <w:r>
           <w:rPr>
             <w:color w:val="1155cc"/>
@@ -9733,7 +9945,7 @@
           <w:vertAlign w:val="baseline"/>
         </w:rPr>
       </w:pPr>
-      <w:bookmarkStart w:colFirst="0" w:colLast="0" w:name="_q33g6gqcesv" w:id="10"/>
+      <w:bookmarkStart w:colFirst="0" w:colLast="0" w:name="_fl0truk0aj0" w:id="10"/>
       <w:bookmarkEnd w:id="10"/>
       <w:r>
         <w:rPr>
@@ -9747,7 +9959,7 @@
       <w:pPr>
         <w:numPr>
           <w:ilvl w:val="0"/>
-          <w:numId w:val="13"/>
+          <w:numId w:val="9"/>
         </w:numPr>
         <w:spacing w:after="0" w:afterAutospacing="0" w:lineRule="auto"/>
         <w:ind w:left="720" w:hanging="360"/>
@@ -9756,7 +9968,7 @@
           <w:vertAlign w:val="baseline"/>
         </w:rPr>
       </w:pPr>
-      <w:hyperlink r:id="rId52">
+      <w:hyperlink r:id="rId59">
         <w:r>
           <w:rPr>
             <w:color w:val="1155cc"/>
@@ -9779,7 +9991,7 @@
       <w:pPr>
         <w:numPr>
           <w:ilvl w:val="0"/>
-          <w:numId w:val="13"/>
+          <w:numId w:val="9"/>
         </w:numPr>
         <w:spacing w:after="0" w:afterAutospacing="0" w:lineRule="auto"/>
         <w:ind w:left="720" w:hanging="360"/>
@@ -9788,7 +10000,7 @@
           <w:vertAlign w:val="baseline"/>
         </w:rPr>
       </w:pPr>
-      <w:hyperlink r:id="rId53">
+      <w:hyperlink r:id="rId60">
         <w:r>
           <w:rPr>
             <w:color w:val="1155cc"/>
@@ -9827,7 +10039,7 @@
       <w:pPr>
         <w:numPr>
           <w:ilvl w:val="0"/>
-          <w:numId w:val="13"/>
+          <w:numId w:val="9"/>
         </w:numPr>
         <w:spacing w:after="0" w:afterAutospacing="0" w:lineRule="auto"/>
         <w:ind w:left="720" w:hanging="360"/>
@@ -9836,7 +10048,7 @@
           <w:vertAlign w:val="baseline"/>
         </w:rPr>
       </w:pPr>
-      <w:hyperlink r:id="rId54">
+      <w:hyperlink r:id="rId61">
         <w:r>
           <w:rPr>
             <w:color w:val="1155cc"/>
@@ -9854,7 +10066,7 @@
         </w:rPr>
         <w:t xml:space="preserve"> and </w:t>
       </w:r>
-      <w:hyperlink r:id="rId55">
+      <w:hyperlink r:id="rId62">
         <w:r>
           <w:rPr>
             <w:color w:val="1155cc"/>
@@ -9877,7 +10089,7 @@
       <w:pPr>
         <w:numPr>
           <w:ilvl w:val="0"/>
-          <w:numId w:val="13"/>
+          <w:numId w:val="9"/>
         </w:numPr>
         <w:spacing w:after="0" w:afterAutospacing="0" w:lineRule="auto"/>
         <w:ind w:left="720" w:hanging="360"/>
@@ -9886,7 +10098,7 @@
           <w:vertAlign w:val="baseline"/>
         </w:rPr>
       </w:pPr>
-      <w:hyperlink r:id="rId56">
+      <w:hyperlink r:id="rId63">
         <w:r>
           <w:rPr>
             <w:color w:val="1155cc"/>
@@ -9925,7 +10137,7 @@
       <w:pPr>
         <w:numPr>
           <w:ilvl w:val="0"/>
-          <w:numId w:val="13"/>
+          <w:numId w:val="9"/>
         </w:numPr>
         <w:spacing w:after="200" w:lineRule="auto"/>
         <w:ind w:left="720" w:hanging="360"/>
@@ -9933,7 +10145,7 @@
           <w:u w:val="none"/>
         </w:rPr>
       </w:pPr>
-      <w:hyperlink r:id="rId57">
+      <w:hyperlink r:id="rId64">
         <w:r>
           <w:rPr>
             <w:color w:val="1155cc"/>
@@ -9959,7 +10171,7 @@
           <w:vertAlign w:val="baseline"/>
         </w:rPr>
       </w:pPr>
-      <w:bookmarkStart w:colFirst="0" w:colLast="0" w:name="_uwbjk9ulwgkm" w:id="11"/>
+      <w:bookmarkStart w:colFirst="0" w:colLast="0" w:name="_e2esdkj26x0e" w:id="11"/>
       <w:bookmarkEnd w:id="11"/>
       <w:r>
         <w:rPr>
@@ -9973,7 +10185,7 @@
       <w:pPr>
         <w:numPr>
           <w:ilvl w:val="0"/>
-          <w:numId w:val="16"/>
+          <w:numId w:val="10"/>
         </w:numPr>
         <w:spacing w:after="0" w:afterAutospacing="0" w:lineRule="auto"/>
         <w:ind w:left="720" w:hanging="360"/>
@@ -9982,7 +10194,7 @@
           <w:vertAlign w:val="baseline"/>
         </w:rPr>
       </w:pPr>
-      <w:hyperlink r:id="rId58">
+      <w:hyperlink r:id="rId65">
         <w:r>
           <w:rPr>
             <w:color w:val="1155cc"/>
@@ -10037,7 +10249,7 @@
       <w:pPr>
         <w:numPr>
           <w:ilvl w:val="0"/>
-          <w:numId w:val="16"/>
+          <w:numId w:val="10"/>
         </w:numPr>
         <w:spacing w:after="0" w:afterAutospacing="0" w:lineRule="auto"/>
         <w:ind w:left="720" w:hanging="360"/>
@@ -10046,7 +10258,7 @@
           <w:vertAlign w:val="baseline"/>
         </w:rPr>
       </w:pPr>
-      <w:hyperlink r:id="rId59">
+      <w:hyperlink r:id="rId66">
         <w:r>
           <w:rPr>
             <w:color w:val="1155cc"/>
@@ -10064,7 +10276,7 @@
         </w:rPr>
         <w:t xml:space="preserve"> and </w:t>
       </w:r>
-      <w:hyperlink r:id="rId60">
+      <w:hyperlink r:id="rId67">
         <w:r>
           <w:rPr>
             <w:color w:val="1155cc"/>
@@ -10087,7 +10299,7 @@
       <w:pPr>
         <w:numPr>
           <w:ilvl w:val="0"/>
-          <w:numId w:val="16"/>
+          <w:numId w:val="10"/>
         </w:numPr>
         <w:spacing w:after="0" w:afterAutospacing="0" w:lineRule="auto"/>
         <w:ind w:left="720" w:hanging="360"/>
@@ -10096,7 +10308,7 @@
           <w:vertAlign w:val="baseline"/>
         </w:rPr>
       </w:pPr>
-      <w:hyperlink r:id="rId61">
+      <w:hyperlink r:id="rId68">
         <w:r>
           <w:rPr>
             <w:color w:val="1155cc"/>
@@ -10114,7 +10326,7 @@
         </w:rPr>
         <w:t xml:space="preserve"> and </w:t>
       </w:r>
-      <w:hyperlink r:id="rId62">
+      <w:hyperlink r:id="rId69">
         <w:r>
           <w:rPr>
             <w:color w:val="1155cc"/>
@@ -10137,7 +10349,7 @@
       <w:pPr>
         <w:numPr>
           <w:ilvl w:val="0"/>
-          <w:numId w:val="16"/>
+          <w:numId w:val="10"/>
         </w:numPr>
         <w:spacing w:after="0" w:afterAutospacing="0" w:lineRule="auto"/>
         <w:ind w:left="720" w:hanging="360"/>
@@ -10146,7 +10358,7 @@
           <w:vertAlign w:val="baseline"/>
         </w:rPr>
       </w:pPr>
-      <w:hyperlink r:id="rId63">
+      <w:hyperlink r:id="rId70">
         <w:r>
           <w:rPr>
             <w:color w:val="1155cc"/>
@@ -10185,7 +10397,7 @@
       <w:pPr>
         <w:numPr>
           <w:ilvl w:val="0"/>
-          <w:numId w:val="16"/>
+          <w:numId w:val="10"/>
         </w:numPr>
         <w:spacing w:after="200" w:lineRule="auto"/>
         <w:ind w:left="720" w:hanging="360"/>
@@ -10193,7 +10405,7 @@
           <w:u w:val="none"/>
         </w:rPr>
       </w:pPr>
-      <w:hyperlink r:id="rId64">
+      <w:hyperlink r:id="rId71">
         <w:r>
           <w:rPr>
             <w:color w:val="1155cc"/>
@@ -10209,7 +10421,7 @@
         </w:rPr>
         <w:t xml:space="preserve">, </w:t>
       </w:r>
-      <w:hyperlink r:id="rId65">
+      <w:hyperlink r:id="rId72">
         <w:r>
           <w:rPr>
             <w:color w:val="1155cc"/>
@@ -10225,7 +10437,7 @@
         </w:rPr>
         <w:t xml:space="preserve">, and </w:t>
       </w:r>
-      <w:hyperlink r:id="rId66">
+      <w:hyperlink r:id="rId73">
         <w:r>
           <w:rPr>
             <w:color w:val="1155cc"/>
@@ -10263,7 +10475,7 @@
         <w:keepLines w:val="1"/>
         <w:rPr/>
       </w:pPr>
-      <w:bookmarkStart w:colFirst="0" w:colLast="0" w:name="_xksqba4vyo1v" w:id="12"/>
+      <w:bookmarkStart w:colFirst="0" w:colLast="0" w:name="_byu0k8bfrd7" w:id="12"/>
       <w:bookmarkEnd w:id="12"/>
       <w:r>
         <w:rPr>
@@ -10297,7 +10509,7 @@
         </w:rPr>
         <w:t xml:space="preserve"> and maps it to the </w:t>
       </w:r>
-      <w:hyperlink r:id="rId67">
+      <w:hyperlink r:id="rId74">
         <w:r>
           <w:rPr>
             <w:color w:val="1155cc"/>
@@ -10321,7 +10533,7 @@
         <w:keepLines w:val="1"/>
         <w:rPr/>
       </w:pPr>
-      <w:bookmarkStart w:colFirst="0" w:colLast="0" w:name="_fe3z0l3kpukt" w:id="13"/>
+      <w:bookmarkStart w:colFirst="0" w:colLast="0" w:name="_lvbdn4gsqq08" w:id="13"/>
       <w:bookmarkEnd w:id="13"/>
       <w:r>
         <w:rPr>
@@ -10334,7 +10546,7 @@
       <w:pPr>
         <w:numPr>
           <w:ilvl w:val="0"/>
-          <w:numId w:val="8"/>
+          <w:numId w:val="13"/>
         </w:numPr>
         <w:spacing w:after="0" w:afterAutospacing="0" w:lineRule="auto"/>
         <w:ind w:left="720" w:hanging="360"/>
@@ -10361,7 +10573,7 @@
       <w:pPr>
         <w:numPr>
           <w:ilvl w:val="0"/>
-          <w:numId w:val="8"/>
+          <w:numId w:val="13"/>
         </w:numPr>
         <w:spacing w:after="200" w:lineRule="auto"/>
         <w:ind w:left="720" w:hanging="360"/>
@@ -10383,7 +10595,7 @@
         </w:rPr>
         <w:t xml:space="preserve"> As documented in </w:t>
       </w:r>
-      <w:hyperlink r:id="rId68">
+      <w:hyperlink r:id="rId75">
         <w:r>
           <w:rPr>
             <w:color w:val="1155cc"/>
@@ -10449,7 +10661,7 @@
         <w:keepLines w:val="1"/>
         <w:rPr/>
       </w:pPr>
-      <w:bookmarkStart w:colFirst="0" w:colLast="0" w:name="_sk3h8kkwiara" w:id="14"/>
+      <w:bookmarkStart w:colFirst="0" w:colLast="0" w:name="_t907nyenduzm" w:id="14"/>
       <w:bookmarkEnd w:id="14"/>
       <w:r>
         <w:rPr>
@@ -10462,7 +10674,7 @@
       <w:pPr>
         <w:numPr>
           <w:ilvl w:val="0"/>
-          <w:numId w:val="9"/>
+          <w:numId w:val="6"/>
         </w:numPr>
         <w:spacing w:after="0" w:afterAutospacing="0" w:lineRule="auto"/>
         <w:ind w:left="720" w:hanging="360"/>
@@ -10489,7 +10701,7 @@
       <w:pPr>
         <w:numPr>
           <w:ilvl w:val="0"/>
-          <w:numId w:val="9"/>
+          <w:numId w:val="6"/>
         </w:numPr>
         <w:spacing w:after="200" w:lineRule="auto"/>
         <w:ind w:left="720" w:hanging="360"/>
@@ -10577,7 +10789,7 @@
           <wp:inline distB="114300" distT="114300" distL="114300" distR="114300">
             <wp:extent cx="5674432" cy="592328"/>
             <wp:effectExtent b="0" l="0" r="0" t="0"/>
-            <wp:docPr id="3" name="image5.png"/>
+            <wp:docPr id="5" name="image5.png"/>
             <a:graphic>
               <a:graphicData uri="http://schemas.openxmlformats.org/drawingml/2006/picture">
                 <pic:pic>
@@ -10586,7 +10798,7 @@
                     <pic:cNvPicPr preferRelativeResize="0"/>
                   </pic:nvPicPr>
                   <pic:blipFill>
-                    <a:blip r:embed="rId69"/>
+                    <a:blip r:embed="rId76"/>
                     <a:srcRect b="0" l="0" r="0" t="0"/>
                     <a:stretch>
                       <a:fillRect/>
@@ -10628,7 +10840,7 @@
       <w:pPr>
         <w:numPr>
           <w:ilvl w:val="0"/>
-          <w:numId w:val="7"/>
+          <w:numId w:val="15"/>
         </w:numPr>
         <w:spacing w:after="0" w:afterAutospacing="0" w:lineRule="auto"/>
         <w:ind w:left="720" w:hanging="360"/>
@@ -10703,7 +10915,7 @@
       <w:pPr>
         <w:numPr>
           <w:ilvl w:val="0"/>
-          <w:numId w:val="7"/>
+          <w:numId w:val="15"/>
         </w:numPr>
         <w:spacing w:after="0" w:afterAutospacing="0" w:lineRule="auto"/>
         <w:ind w:left="720" w:hanging="360"/>
@@ -10735,7 +10947,7 @@
       <w:pPr>
         <w:numPr>
           <w:ilvl w:val="0"/>
-          <w:numId w:val="7"/>
+          <w:numId w:val="15"/>
         </w:numPr>
         <w:spacing w:after="200" w:lineRule="auto"/>
         <w:ind w:left="720" w:hanging="360"/>
@@ -10908,7 +11120,7 @@
         <w:keepLines w:val="1"/>
         <w:rPr/>
       </w:pPr>
-      <w:bookmarkStart w:colFirst="0" w:colLast="0" w:name="_kgcjqvegdrc2" w:id="15"/>
+      <w:bookmarkStart w:colFirst="0" w:colLast="0" w:name="_s71tgrz9lcoi" w:id="15"/>
       <w:bookmarkEnd w:id="15"/>
       <w:r>
         <w:rPr>
@@ -10921,7 +11133,7 @@
       <w:pPr>
         <w:numPr>
           <w:ilvl w:val="0"/>
-          <w:numId w:val="15"/>
+          <w:numId w:val="8"/>
         </w:numPr>
         <w:spacing w:after="0" w:afterAutospacing="0" w:lineRule="auto"/>
         <w:ind w:left="720" w:hanging="360"/>
@@ -11018,7 +11230,7 @@
       <w:pPr>
         <w:numPr>
           <w:ilvl w:val="0"/>
-          <w:numId w:val="15"/>
+          <w:numId w:val="8"/>
         </w:numPr>
         <w:spacing w:after="200" w:lineRule="auto"/>
         <w:ind w:left="720" w:hanging="360"/>
@@ -11189,16 +11401,16 @@
           <wp:inline distB="114300" distT="114300" distL="114300" distR="114300">
             <wp:extent cx="5674868" cy="1195263"/>
             <wp:effectExtent b="0" l="0" r="0" t="0"/>
-            <wp:docPr id="1" name="image2.png"/>
+            <wp:docPr id="1" name="image7.png"/>
             <a:graphic>
               <a:graphicData uri="http://schemas.openxmlformats.org/drawingml/2006/picture">
                 <pic:pic>
                   <pic:nvPicPr>
-                    <pic:cNvPr id="0" name="image2.png"/>
+                    <pic:cNvPr id="0" name="image7.png"/>
                     <pic:cNvPicPr preferRelativeResize="0"/>
                   </pic:nvPicPr>
                   <pic:blipFill>
-                    <a:blip r:embed="rId70"/>
+                    <a:blip r:embed="rId77"/>
                     <a:srcRect b="0" l="0" r="0" t="0"/>
                     <a:stretch>
                       <a:fillRect/>
@@ -11240,7 +11452,7 @@
       <w:pPr>
         <w:numPr>
           <w:ilvl w:val="0"/>
-          <w:numId w:val="3"/>
+          <w:numId w:val="5"/>
         </w:numPr>
         <w:spacing w:after="0" w:afterAutospacing="0" w:lineRule="auto"/>
         <w:ind w:left="720" w:hanging="360"/>
@@ -11328,7 +11540,7 @@
       <w:pPr>
         <w:numPr>
           <w:ilvl w:val="0"/>
-          <w:numId w:val="3"/>
+          <w:numId w:val="5"/>
         </w:numPr>
         <w:spacing w:after="0" w:afterAutospacing="0" w:lineRule="auto"/>
         <w:ind w:left="720" w:hanging="360"/>
@@ -11374,7 +11586,7 @@
       <w:pPr>
         <w:numPr>
           <w:ilvl w:val="0"/>
-          <w:numId w:val="3"/>
+          <w:numId w:val="5"/>
         </w:numPr>
         <w:spacing w:after="0" w:afterAutospacing="0" w:lineRule="auto"/>
         <w:ind w:left="720" w:hanging="360"/>
@@ -11406,7 +11618,7 @@
       <w:pPr>
         <w:numPr>
           <w:ilvl w:val="0"/>
-          <w:numId w:val="3"/>
+          <w:numId w:val="5"/>
         </w:numPr>
         <w:spacing w:after="200" w:lineRule="auto"/>
         <w:ind w:left="720" w:hanging="360"/>
@@ -11525,7 +11737,7 @@
         </w:rPr>
         <w:t xml:space="preserve"> via </w:t>
       </w:r>
-      <w:hyperlink r:id="rId71">
+      <w:hyperlink r:id="rId78">
         <w:r>
           <w:rPr>
             <w:rFonts w:ascii="Roboto Mono" w:cs="Roboto Mono" w:eastAsia="Roboto Mono" w:hAnsi="Roboto Mono"/>
@@ -11550,7 +11762,7 @@
         <w:keepLines w:val="1"/>
         <w:rPr/>
       </w:pPr>
-      <w:bookmarkStart w:colFirst="0" w:colLast="0" w:name="_abirxg6ri4dq" w:id="16"/>
+      <w:bookmarkStart w:colFirst="0" w:colLast="0" w:name="_xsf5amc4d5r3" w:id="16"/>
       <w:bookmarkEnd w:id="16"/>
       <w:r>
         <w:rPr>
@@ -11563,7 +11775,7 @@
       <w:pPr>
         <w:numPr>
           <w:ilvl w:val="0"/>
-          <w:numId w:val="2"/>
+          <w:numId w:val="12"/>
         </w:numPr>
         <w:spacing w:after="0" w:afterAutospacing="0" w:lineRule="auto"/>
         <w:ind w:left="720" w:hanging="360"/>
@@ -11632,7 +11844,7 @@
       <w:pPr>
         <w:numPr>
           <w:ilvl w:val="0"/>
-          <w:numId w:val="2"/>
+          <w:numId w:val="12"/>
         </w:numPr>
         <w:spacing w:after="200" w:lineRule="auto"/>
         <w:ind w:left="720" w:hanging="360"/>
@@ -13165,7 +13377,7 @@
       <w:pPr>
         <w:numPr>
           <w:ilvl w:val="0"/>
-          <w:numId w:val="1"/>
+          <w:numId w:val="11"/>
         </w:numPr>
         <w:shd w:fill="auto" w:val="clear"/>
         <w:spacing w:after="200" w:before="360" w:lineRule="auto"/>
@@ -13200,7 +13412,7 @@
         </w:rPr>
         <w:t xml:space="preserve"> in </w:t>
       </w:r>
-      <w:hyperlink r:id="rId72">
+      <w:hyperlink r:id="rId79">
         <w:r>
           <w:rPr>
             <w:rFonts w:ascii="Roboto Mono" w:cs="Roboto Mono" w:eastAsia="Roboto Mono" w:hAnsi="Roboto Mono"/>
@@ -13221,7 +13433,7 @@
         </w:rPr>
         <w:t xml:space="preserve"> &amp; </w:t>
       </w:r>
-      <w:hyperlink r:id="rId73">
+      <w:hyperlink r:id="rId80">
         <w:r>
           <w:rPr>
             <w:rFonts w:ascii="Roboto Mono" w:cs="Roboto Mono" w:eastAsia="Roboto Mono" w:hAnsi="Roboto Mono"/>
@@ -13248,7 +13460,7 @@
         </w:rPr>
         <w:t xml:space="preserve"> Every external SaaS integration is governed by </w:t>
       </w:r>
-      <w:hyperlink r:id="rId74">
+      <w:hyperlink r:id="rId81">
         <w:r>
           <w:rPr>
             <w:rFonts w:ascii="Roboto Mono" w:cs="Roboto Mono" w:eastAsia="Roboto Mono" w:hAnsi="Roboto Mono"/>
@@ -18466,7 +18678,7 @@
         <w:spacing w:before="360" w:lineRule="auto"/>
         <w:rPr/>
       </w:pPr>
-      <w:bookmarkStart w:colFirst="0" w:colLast="0" w:name="_2tqxgdq12gnp" w:id="17"/>
+      <w:bookmarkStart w:colFirst="0" w:colLast="0" w:name="_q5djf71cxnsb" w:id="17"/>
       <w:bookmarkEnd w:id="17"/>
       <w:r>
         <w:rPr>
@@ -18479,7 +18691,7 @@
       <w:pPr>
         <w:numPr>
           <w:ilvl w:val="0"/>
-          <w:numId w:val="4"/>
+          <w:numId w:val="17"/>
         </w:numPr>
         <w:spacing w:after="0" w:afterAutospacing="0" w:lineRule="auto"/>
         <w:ind w:left="720" w:hanging="360"/>
@@ -18502,7 +18714,7 @@
       <w:pPr>
         <w:numPr>
           <w:ilvl w:val="1"/>
-          <w:numId w:val="4"/>
+          <w:numId w:val="17"/>
         </w:numPr>
         <w:spacing w:after="0" w:afterAutospacing="0" w:lineRule="auto"/>
         <w:ind w:left="1440" w:hanging="360"/>
@@ -18538,7 +18750,7 @@
         </w:rPr>
         <w:t xml:space="preserve"> and Pattern A Pooled Architecture (</w:t>
       </w:r>
-      <w:hyperlink r:id="rId75">
+      <w:hyperlink r:id="rId82">
         <w:r>
           <w:rPr>
             <w:color w:val="1155cc"/>
@@ -18559,7 +18771,7 @@
       <w:pPr>
         <w:numPr>
           <w:ilvl w:val="1"/>
-          <w:numId w:val="4"/>
+          <w:numId w:val="17"/>
         </w:numPr>
         <w:spacing w:after="0" w:afterAutospacing="0" w:lineRule="auto"/>
         <w:ind w:left="1440" w:hanging="360"/>
@@ -18581,7 +18793,7 @@
         </w:rPr>
         <w:t xml:space="preserve"> Stamp out Pattern B Sovereign Silos via Terraform for regulated anchor customers (</w:t>
       </w:r>
-      <w:hyperlink r:id="rId76">
+      <w:hyperlink r:id="rId83">
         <w:r>
           <w:rPr>
             <w:color w:val="1155cc"/>
@@ -18602,7 +18814,7 @@
       <w:pPr>
         <w:numPr>
           <w:ilvl w:val="1"/>
-          <w:numId w:val="4"/>
+          <w:numId w:val="17"/>
         </w:numPr>
         <w:spacing w:after="200" w:lineRule="auto"/>
         <w:ind w:left="1440" w:hanging="360"/>
@@ -18624,7 +18836,7 @@
         </w:rPr>
         <w:t xml:space="preserve"> Enable the Pattern C Hybrid Router and 3-phase zero-downtime live tier migrator (</w:t>
       </w:r>
-      <w:hyperlink r:id="rId77">
+      <w:hyperlink r:id="rId84">
         <w:r>
           <w:rPr>
             <w:color w:val="1155cc"/>
@@ -18942,7 +19154,7 @@
         </w:rPr>
         <w:t xml:space="preserve">) or deploy any of the three topologies via their 1-click Terraform scripts (</w:t>
       </w:r>
-      <w:hyperlink r:id="rId78">
+      <w:hyperlink r:id="rId85">
         <w:r>
           <w:rPr>
             <w:rFonts w:ascii="Roboto Mono" w:cs="Roboto Mono" w:eastAsia="Roboto Mono" w:hAnsi="Roboto Mono"/>
@@ -18959,7 +19171,7 @@
         </w:rPr>
         <w:t xml:space="preserve">, </w:t>
       </w:r>
-      <w:hyperlink r:id="rId79">
+      <w:hyperlink r:id="rId86">
         <w:r>
           <w:rPr>
             <w:rFonts w:ascii="Roboto Mono" w:cs="Roboto Mono" w:eastAsia="Roboto Mono" w:hAnsi="Roboto Mono"/>
@@ -18976,7 +19188,7 @@
         </w:rPr>
         <w:t xml:space="preserve">, and </w:t>
       </w:r>
-      <w:hyperlink r:id="rId80">
+      <w:hyperlink r:id="rId87">
         <w:r>
           <w:rPr>
             <w:rFonts w:ascii="Roboto Mono" w:cs="Roboto Mono" w:eastAsia="Roboto Mono" w:hAnsi="Roboto Mono"/>
@@ -19001,7 +19213,7 @@
         <w:keepLines w:val="1"/>
         <w:rPr/>
       </w:pPr>
-      <w:bookmarkStart w:colFirst="0" w:colLast="0" w:name="_53fx4zmy4qi6" w:id="18"/>
+      <w:bookmarkStart w:colFirst="0" w:colLast="0" w:name="_d18ytxujrw4i" w:id="18"/>
       <w:bookmarkEnd w:id="18"/>
       <w:r>
         <w:rPr>
@@ -20464,7 +20676,7 @@
                 <w:szCs w:val="19"/>
               </w:rPr>
             </w:pPr>
-            <w:hyperlink r:id="rId81">
+            <w:hyperlink r:id="rId88">
               <w:r>
                 <w:rPr>
                   <w:color w:val="1155cc"/>
@@ -20476,7 +20688,7 @@
                 <w:t xml:space="preserve">Live S3 Ledger JSON (</w:t>
               </w:r>
             </w:hyperlink>
-            <w:hyperlink r:id="rId82">
+            <w:hyperlink r:id="rId89">
               <w:r>
                 <w:rPr>
                   <w:rFonts w:ascii="Roboto Mono" w:cs="Roboto Mono" w:eastAsia="Roboto Mono" w:hAnsi="Roboto Mono"/>
@@ -20489,7 +20701,7 @@
                 <w:t xml:space="preserve">thoughtspot-spotter</w:t>
               </w:r>
             </w:hyperlink>
-            <w:hyperlink r:id="rId83">
+            <w:hyperlink r:id="rId90">
               <w:r>
                 <w:rPr>
                   <w:color w:val="1155cc"/>
@@ -21178,7 +21390,7 @@
                 <w:szCs w:val="19"/>
               </w:rPr>
             </w:pPr>
-            <w:hyperlink r:id="rId84">
+            <w:hyperlink r:id="rId91">
               <w:r>
                 <w:rPr>
                   <w:color w:val="1155cc"/>
@@ -21190,7 +21402,7 @@
                 <w:t xml:space="preserve">Live S3 Ledger JSON (</w:t>
               </w:r>
             </w:hyperlink>
-            <w:hyperlink r:id="rId85">
+            <w:hyperlink r:id="rId92">
               <w:r>
                 <w:rPr>
                   <w:rFonts w:ascii="Roboto Mono" w:cs="Roboto Mono" w:eastAsia="Roboto Mono" w:hAnsi="Roboto Mono"/>
@@ -21203,7 +21415,7 @@
                 <w:t xml:space="preserve">sigma-computing</w:t>
               </w:r>
             </w:hyperlink>
-            <w:hyperlink r:id="rId86">
+            <w:hyperlink r:id="rId93">
               <w:r>
                 <w:rPr>
                   <w:color w:val="1155cc"/>
@@ -21902,7 +22114,7 @@
                 <w:szCs w:val="19"/>
               </w:rPr>
             </w:pPr>
-            <w:hyperlink r:id="rId87">
+            <w:hyperlink r:id="rId94">
               <w:r>
                 <w:rPr>
                   <w:color w:val="1155cc"/>
@@ -21914,7 +22126,7 @@
                 <w:t xml:space="preserve">Live S3 Ledger JSON (</w:t>
               </w:r>
             </w:hyperlink>
-            <w:hyperlink r:id="rId88">
+            <w:hyperlink r:id="rId95">
               <w:r>
                 <w:rPr>
                   <w:rFonts w:ascii="Roboto Mono" w:cs="Roboto Mono" w:eastAsia="Roboto Mono" w:hAnsi="Roboto Mono"/>
@@ -21927,7 +22139,7 @@
                 <w:t xml:space="preserve">servicenow-itsm</w:t>
               </w:r>
             </w:hyperlink>
-            <w:hyperlink r:id="rId89">
+            <w:hyperlink r:id="rId96">
               <w:r>
                 <w:rPr>
                   <w:color w:val="1155cc"/>
@@ -22553,7 +22765,7 @@
                 <w:szCs w:val="19"/>
               </w:rPr>
             </w:pPr>
-            <w:hyperlink r:id="rId90">
+            <w:hyperlink r:id="rId97">
               <w:r>
                 <w:rPr>
                   <w:color w:val="1155cc"/>
@@ -22565,7 +22777,7 @@
                 <w:t xml:space="preserve">Live S3 Ledger JSON (</w:t>
               </w:r>
             </w:hyperlink>
-            <w:hyperlink r:id="rId91">
+            <w:hyperlink r:id="rId98">
               <w:r>
                 <w:rPr>
                   <w:rFonts w:ascii="Roboto Mono" w:cs="Roboto Mono" w:eastAsia="Roboto Mono" w:hAnsi="Roboto Mono"/>
@@ -22578,7 +22790,7 @@
                 <w:t xml:space="preserve">muse-poc</w:t>
               </w:r>
             </w:hyperlink>
-            <w:hyperlink r:id="rId92">
+            <w:hyperlink r:id="rId99">
               <w:r>
                 <w:rPr>
                   <w:color w:val="1155cc"/>
@@ -23220,7 +23432,7 @@
                 <w:szCs w:val="19"/>
               </w:rPr>
             </w:pPr>
-            <w:hyperlink r:id="rId93">
+            <w:hyperlink r:id="rId100">
               <w:r>
                 <w:rPr>
                   <w:color w:val="1155cc"/>
@@ -23232,7 +23444,7 @@
                 <w:t xml:space="preserve">Live S3 Ledger JSON (</w:t>
               </w:r>
             </w:hyperlink>
-            <w:hyperlink r:id="rId94">
+            <w:hyperlink r:id="rId101">
               <w:r>
                 <w:rPr>
                   <w:rFonts w:ascii="Roboto Mono" w:cs="Roboto Mono" w:eastAsia="Roboto Mono" w:hAnsi="Roboto Mono"/>
@@ -23245,7 +23457,7 @@
                 <w:t xml:space="preserve">salesforce-jira</w:t>
               </w:r>
             </w:hyperlink>
-            <w:hyperlink r:id="rId95">
+            <w:hyperlink r:id="rId102">
               <w:r>
                 <w:rPr>
                   <w:color w:val="1155cc"/>
@@ -23940,7 +24152,7 @@
                 <w:szCs w:val="19"/>
               </w:rPr>
             </w:pPr>
-            <w:hyperlink r:id="rId96">
+            <w:hyperlink r:id="rId103">
               <w:r>
                 <w:rPr>
                   <w:color w:val="1155cc"/>
@@ -23952,7 +24164,7 @@
                 <w:t xml:space="preserve">Live S3 Ledger JSON (</w:t>
               </w:r>
             </w:hyperlink>
-            <w:hyperlink r:id="rId97">
+            <w:hyperlink r:id="rId104">
               <w:r>
                 <w:rPr>
                   <w:rFonts w:ascii="Roboto Mono" w:cs="Roboto Mono" w:eastAsia="Roboto Mono" w:hAnsi="Roboto Mono"/>
@@ -23965,7 +24177,7 @@
                 <w:t xml:space="preserve">databricks-unity</w:t>
               </w:r>
             </w:hyperlink>
-            <w:hyperlink r:id="rId98">
+            <w:hyperlink r:id="rId105">
               <w:r>
                 <w:rPr>
                   <w:color w:val="1155cc"/>
@@ -24641,7 +24853,7 @@
                 <w:szCs w:val="19"/>
               </w:rPr>
             </w:pPr>
-            <w:hyperlink r:id="rId99">
+            <w:hyperlink r:id="rId106">
               <w:r>
                 <w:rPr>
                   <w:color w:val="1155cc"/>
@@ -24653,7 +24865,7 @@
                 <w:t xml:space="preserve">Live S3 Ledger JSON (</w:t>
               </w:r>
             </w:hyperlink>
-            <w:hyperlink r:id="rId100">
+            <w:hyperlink r:id="rId107">
               <w:r>
                 <w:rPr>
                   <w:rFonts w:ascii="Roboto Mono" w:cs="Roboto Mono" w:eastAsia="Roboto Mono" w:hAnsi="Roboto Mono"/>
@@ -24666,7 +24878,7 @@
                 <w:t xml:space="preserve">snowflake-cortex</w:t>
               </w:r>
             </w:hyperlink>
-            <w:hyperlink r:id="rId101">
+            <w:hyperlink r:id="rId108">
               <w:r>
                 <w:rPr>
                   <w:color w:val="1155cc"/>
@@ -25283,7 +25495,7 @@
                 <w:szCs w:val="19"/>
               </w:rPr>
             </w:pPr>
-            <w:hyperlink r:id="rId102">
+            <w:hyperlink r:id="rId109">
               <w:r>
                 <w:rPr>
                   <w:color w:val="1155cc"/>
@@ -25295,7 +25507,7 @@
                 <w:t xml:space="preserve">Live S3 Ledger JSON (</w:t>
               </w:r>
             </w:hyperlink>
-            <w:hyperlink r:id="rId103">
+            <w:hyperlink r:id="rId110">
               <w:r>
                 <w:rPr>
                   <w:rFonts w:ascii="Roboto Mono" w:cs="Roboto Mono" w:eastAsia="Roboto Mono" w:hAnsi="Roboto Mono"/>
@@ -25308,7 +25520,7 @@
                 <w:t xml:space="preserve">workday-raas</w:t>
               </w:r>
             </w:hyperlink>
-            <w:hyperlink r:id="rId104">
+            <w:hyperlink r:id="rId111">
               <w:r>
                 <w:rPr>
                   <w:color w:val="1155cc"/>
@@ -25932,7 +26144,7 @@
                 <w:szCs w:val="19"/>
               </w:rPr>
             </w:pPr>
-            <w:hyperlink r:id="rId105">
+            <w:hyperlink r:id="rId112">
               <w:r>
                 <w:rPr>
                   <w:color w:val="1155cc"/>
@@ -25944,7 +26156,7 @@
                 <w:t xml:space="preserve">Live S3 Ledger JSON (</w:t>
               </w:r>
             </w:hyperlink>
-            <w:hyperlink r:id="rId106">
+            <w:hyperlink r:id="rId113">
               <w:r>
                 <w:rPr>
                   <w:rFonts w:ascii="Roboto Mono" w:cs="Roboto Mono" w:eastAsia="Roboto Mono" w:hAnsi="Roboto Mono"/>
@@ -25957,7 +26169,7 @@
                 <w:t xml:space="preserve">datadog-sre</w:t>
               </w:r>
             </w:hyperlink>
-            <w:hyperlink r:id="rId107">
+            <w:hyperlink r:id="rId114">
               <w:r>
                 <w:rPr>
                   <w:color w:val="1155cc"/>
@@ -26611,7 +26823,7 @@
                 <w:szCs w:val="19"/>
               </w:rPr>
             </w:pPr>
-            <w:hyperlink r:id="rId108">
+            <w:hyperlink r:id="rId115">
               <w:r>
                 <w:rPr>
                   <w:color w:val="1155cc"/>
@@ -26623,7 +26835,7 @@
                 <w:t xml:space="preserve">Live S3 Ledger JSON (</w:t>
               </w:r>
             </w:hyperlink>
-            <w:hyperlink r:id="rId109">
+            <w:hyperlink r:id="rId116">
               <w:r>
                 <w:rPr>
                   <w:rFonts w:ascii="Roboto Mono" w:cs="Roboto Mono" w:eastAsia="Roboto Mono" w:hAnsi="Roboto Mono"/>
@@ -26636,7 +26848,7 @@
                 <w:t xml:space="preserve">crowdstrike-okta</w:t>
               </w:r>
             </w:hyperlink>
-            <w:hyperlink r:id="rId110">
+            <w:hyperlink r:id="rId117">
               <w:r>
                 <w:rPr>
                   <w:color w:val="1155cc"/>
@@ -26966,7 +27178,7 @@
         </w:rPr>
         <w:t xml:space="preserve">, verified in </w:t>
       </w:r>
-      <w:hyperlink r:id="rId111">
+      <w:hyperlink r:id="rId118">
         <w:r>
           <w:rPr>
             <w:rFonts w:ascii="Roboto Mono" w:cs="Roboto Mono" w:eastAsia="Roboto Mono" w:hAnsi="Roboto Mono"/>
@@ -26983,7 +27195,7 @@
         </w:rPr>
         <w:t xml:space="preserve"> and replayed via </w:t>
       </w:r>
-      <w:hyperlink r:id="rId112">
+      <w:hyperlink r:id="rId119">
         <w:r>
           <w:rPr>
             <w:rFonts w:ascii="Roboto Mono" w:cs="Roboto Mono" w:eastAsia="Roboto Mono" w:hAnsi="Roboto Mono"/>
@@ -27000,7 +27212,7 @@
         </w:rPr>
         <w:t xml:space="preserve"> (</w:t>
       </w:r>
-      <w:hyperlink r:id="rId113">
+      <w:hyperlink r:id="rId120">
         <w:r>
           <w:rPr>
             <w:rFonts w:ascii="Roboto Mono" w:cs="Roboto Mono" w:eastAsia="Roboto Mono" w:hAnsi="Roboto Mono"/>
@@ -27025,7 +27237,7 @@
         <w:keepLines w:val="1"/>
         <w:rPr/>
       </w:pPr>
-      <w:bookmarkStart w:colFirst="0" w:colLast="0" w:name="_et98bla31mmr" w:id="19"/>
+      <w:bookmarkStart w:colFirst="0" w:colLast="0" w:name="_4p7du2x76s51" w:id="19"/>
       <w:bookmarkEnd w:id="19"/>
       <w:r>
         <w:rPr>
@@ -27149,7 +27361,7 @@
         </w:rPr>
         <w:t xml:space="preserve"> Retina, distinct SHA-256 verified in </w:t>
       </w:r>
-      <w:hyperlink r:id="rId114">
+      <w:hyperlink r:id="rId121">
         <w:r>
           <w:rPr>
             <w:rFonts w:ascii="Roboto Mono" w:cs="Roboto Mono" w:eastAsia="Roboto Mono" w:hAnsi="Roboto Mono"/>
@@ -27194,7 +27406,7 @@
         </w:rPr>
         <w:t xml:space="preserve"> buttons directly below, inspect the </w:t>
       </w:r>
-      <w:hyperlink r:id="rId115">
+      <w:hyperlink r:id="rId122">
         <w:r>
           <w:rPr>
             <w:color w:val="1155cc"/>
@@ -27204,7 +27416,7 @@
           <w:t xml:space="preserve">10-SaaS Manual Testing Playbook (</w:t>
         </w:r>
       </w:hyperlink>
-      <w:hyperlink r:id="rId116">
+      <w:hyperlink r:id="rId123">
         <w:r>
           <w:rPr>
             <w:rFonts w:ascii="Roboto Mono" w:cs="Roboto Mono" w:eastAsia="Roboto Mono" w:hAnsi="Roboto Mono"/>
@@ -27215,7 +27427,7 @@
           <w:t xml:space="preserve">docs/10-THIRD-PARTY-SAAS-3-PATTERN-MANUAL-TESTING-PLAYBOOK.md</w:t>
         </w:r>
       </w:hyperlink>
-      <w:hyperlink r:id="rId117">
+      <w:hyperlink r:id="rId124">
         <w:r>
           <w:rPr>
             <w:color w:val="1155cc"/>
@@ -27236,7 +27448,7 @@
       <w:pPr>
         <w:numPr>
           <w:ilvl w:val="0"/>
-          <w:numId w:val="12"/>
+          <w:numId w:val="4"/>
         </w:numPr>
         <w:spacing w:after="200" w:lineRule="auto"/>
         <w:ind w:left="720" w:hanging="360"/>
@@ -27336,7 +27548,7 @@
           <wp:inline distB="114300" distT="114300" distL="114300" distR="114300">
             <wp:extent cx="6727635" cy="4206875"/>
             <wp:effectExtent b="0" l="0" r="0" t="0"/>
-            <wp:docPr id="5" name="image3.png"/>
+            <wp:docPr id="6" name="image3.png"/>
             <a:graphic>
               <a:graphicData uri="http://schemas.openxmlformats.org/drawingml/2006/picture">
                 <pic:pic>
@@ -27345,7 +27557,7 @@
                     <pic:cNvPicPr preferRelativeResize="0"/>
                   </pic:nvPicPr>
                   <pic:blipFill>
-                    <a:blip r:embed="rId118"/>
+                    <a:blip r:embed="rId125"/>
                     <a:srcRect b="0" l="0" r="0" t="0"/>
                     <a:stretch>
                       <a:fillRect/>
@@ -27401,16 +27613,16 @@
           <wp:inline distB="114300" distT="114300" distL="114300" distR="114300">
             <wp:extent cx="6727635" cy="4206875"/>
             <wp:effectExtent b="0" l="0" r="0" t="0"/>
-            <wp:docPr id="4" name="image4.png"/>
+            <wp:docPr id="7" name="image2.png"/>
             <a:graphic>
               <a:graphicData uri="http://schemas.openxmlformats.org/drawingml/2006/picture">
                 <pic:pic>
                   <pic:nvPicPr>
-                    <pic:cNvPr id="0" name="image4.png"/>
+                    <pic:cNvPr id="0" name="image2.png"/>
                     <pic:cNvPicPr preferRelativeResize="0"/>
                   </pic:nvPicPr>
                   <pic:blipFill>
-                    <a:blip r:embed="rId119"/>
+                    <a:blip r:embed="rId126"/>
                     <a:srcRect b="0" l="0" r="0" t="0"/>
                     <a:stretch>
                       <a:fillRect/>
@@ -27457,7 +27669,7 @@
       <w:pPr>
         <w:numPr>
           <w:ilvl w:val="0"/>
-          <w:numId w:val="14"/>
+          <w:numId w:val="18"/>
         </w:numPr>
         <w:spacing w:after="200" w:lineRule="auto"/>
         <w:ind w:left="720" w:hanging="360"/>
@@ -27557,7 +27769,7 @@
           <wp:inline distB="114300" distT="114300" distL="114300" distR="114300">
             <wp:extent cx="6727635" cy="4206875"/>
             <wp:effectExtent b="0" l="0" r="0" t="0"/>
-            <wp:docPr id="6" name="image1.png"/>
+            <wp:docPr id="4" name="image1.png"/>
             <a:graphic>
               <a:graphicData uri="http://schemas.openxmlformats.org/drawingml/2006/picture">
                 <pic:pic>
@@ -27566,7 +27778,7 @@
                     <pic:cNvPicPr preferRelativeResize="0"/>
                   </pic:nvPicPr>
                   <pic:blipFill>
-                    <a:blip r:embed="rId120"/>
+                    <a:blip r:embed="rId127"/>
                     <a:srcRect b="0" l="0" r="0" t="0"/>
                     <a:stretch>
                       <a:fillRect/>
@@ -27622,16 +27834,16 @@
           <wp:inline distB="114300" distT="114300" distL="114300" distR="114300">
             <wp:extent cx="6727635" cy="4206875"/>
             <wp:effectExtent b="0" l="0" r="0" t="0"/>
-            <wp:docPr id="2" name="image6.png"/>
+            <wp:docPr id="3" name="image4.png"/>
             <a:graphic>
               <a:graphicData uri="http://schemas.openxmlformats.org/drawingml/2006/picture">
                 <pic:pic>
                   <pic:nvPicPr>
-                    <pic:cNvPr id="0" name="image6.png"/>
+                    <pic:cNvPr id="0" name="image4.png"/>
                     <pic:cNvPicPr preferRelativeResize="0"/>
                   </pic:nvPicPr>
                   <pic:blipFill>
-                    <a:blip r:embed="rId121"/>
+                    <a:blip r:embed="rId128"/>
                     <a:srcRect b="0" l="0" r="0" t="0"/>
                     <a:stretch>
                       <a:fillRect/>
@@ -27681,7 +27893,7 @@
         <w:keepLines w:val="1"/>
         <w:rPr/>
       </w:pPr>
-      <w:bookmarkStart w:colFirst="0" w:colLast="0" w:name="_dnhsmgb8dhfr" w:id="20"/>
+      <w:bookmarkStart w:colFirst="0" w:colLast="0" w:name="_hnrqirf1bief" w:id="20"/>
       <w:bookmarkEnd w:id="20"/>
       <w:r>
         <w:rPr>
@@ -27697,7 +27909,7 @@
         <w:keepLines w:val="1"/>
         <w:rPr/>
       </w:pPr>
-      <w:bookmarkStart w:colFirst="0" w:colLast="0" w:name="_klbzdq8vy0of" w:id="21"/>
+      <w:bookmarkStart w:colFirst="0" w:colLast="0" w:name="_lqwzcipjw30t" w:id="21"/>
       <w:bookmarkEnd w:id="21"/>
       <w:r>
         <w:rPr>
@@ -27717,7 +27929,7 @@
         </w:rPr>
         <w:t xml:space="preserve">Open the </w:t>
       </w:r>
-      <w:hyperlink r:id="rId122">
+      <w:hyperlink r:id="rId129">
         <w:r>
           <w:rPr>
             <w:color w:val="1155cc"/>
@@ -27727,7 +27939,7 @@
           <w:t xml:space="preserve">Workstream 5 Editable Google Slides Deck (</w:t>
         </w:r>
       </w:hyperlink>
-      <w:hyperlink r:id="rId123">
+      <w:hyperlink r:id="rId130">
         <w:r>
           <w:rPr>
             <w:rFonts w:ascii="Roboto Mono" w:cs="Roboto Mono" w:eastAsia="Roboto Mono" w:hAnsi="Roboto Mono"/>
@@ -27738,7 +27950,7 @@
           <w:t xml:space="preserve">ws5-wrap-up-editable-slides.pptx</w:t>
         </w:r>
       </w:hyperlink>
-      <w:hyperlink r:id="rId124">
+      <w:hyperlink r:id="rId131">
         <w:r>
           <w:rPr>
             <w:color w:val="1155cc"/>
@@ -27754,7 +27966,7 @@
         </w:rPr>
         <w:t xml:space="preserve"> or the </w:t>
       </w:r>
-      <w:hyperlink r:id="rId125">
+      <w:hyperlink r:id="rId132">
         <w:r>
           <w:rPr>
             <w:color w:val="1155cc"/>
@@ -27764,7 +27976,7 @@
           <w:t xml:space="preserve">All-in-One 25-Slide Master Presentation (</w:t>
         </w:r>
       </w:hyperlink>
-      <w:hyperlink r:id="rId126">
+      <w:hyperlink r:id="rId133">
         <w:r>
           <w:rPr>
             <w:rFonts w:ascii="Roboto Mono" w:cs="Roboto Mono" w:eastAsia="Roboto Mono" w:hAnsi="Roboto Mono"/>
@@ -27775,7 +27987,7 @@
           <w:t xml:space="preserve">geap-multi-tenancy-all-workstreams-editable-slides.pptx</w:t>
         </w:r>
       </w:hyperlink>
-      <w:hyperlink r:id="rId127">
+      <w:hyperlink r:id="rId134">
         <w:r>
           <w:rPr>
             <w:color w:val="1155cc"/>
@@ -28192,7 +28404,7 @@
                 <w:szCs w:val="19"/>
               </w:rPr>
             </w:pPr>
-            <w:hyperlink r:id="rId128">
+            <w:hyperlink r:id="rId135">
               <w:r>
                 <w:rPr>
                   <w:rFonts w:ascii="Roboto Mono" w:cs="Roboto Mono" w:eastAsia="Roboto Mono" w:hAnsi="Roboto Mono"/>
@@ -28372,7 +28584,7 @@
                 <w:szCs w:val="19"/>
               </w:rPr>
             </w:pPr>
-            <w:hyperlink r:id="rId129">
+            <w:hyperlink r:id="rId136">
               <w:r>
                 <w:rPr>
                   <w:rFonts w:ascii="Roboto Mono" w:cs="Roboto Mono" w:eastAsia="Roboto Mono" w:hAnsi="Roboto Mono"/>
@@ -28570,7 +28782,7 @@
                 <w:szCs w:val="19"/>
               </w:rPr>
             </w:pPr>
-            <w:hyperlink r:id="rId130">
+            <w:hyperlink r:id="rId137">
               <w:r>
                 <w:rPr>
                   <w:rFonts w:ascii="Roboto Mono" w:cs="Roboto Mono" w:eastAsia="Roboto Mono" w:hAnsi="Roboto Mono"/>
@@ -28591,7 +28803,7 @@
               </w:rPr>
               <w:t xml:space="preserve"> • </w:t>
             </w:r>
-            <w:hyperlink r:id="rId131">
+            <w:hyperlink r:id="rId138">
               <w:r>
                 <w:rPr>
                   <w:rFonts w:ascii="Roboto Mono" w:cs="Roboto Mono" w:eastAsia="Roboto Mono" w:hAnsi="Roboto Mono"/>
@@ -28753,7 +28965,7 @@
                 <w:szCs w:val="19"/>
               </w:rPr>
             </w:pPr>
-            <w:hyperlink r:id="rId132">
+            <w:hyperlink r:id="rId139">
               <w:r>
                 <w:rPr>
                   <w:rFonts w:ascii="Roboto Mono" w:cs="Roboto Mono" w:eastAsia="Roboto Mono" w:hAnsi="Roboto Mono"/>
@@ -28774,7 +28986,7 @@
               </w:rPr>
               <w:t xml:space="preserve"> • </w:t>
             </w:r>
-            <w:hyperlink r:id="rId133">
+            <w:hyperlink r:id="rId140">
               <w:r>
                 <w:rPr>
                   <w:rFonts w:ascii="Roboto Mono" w:cs="Roboto Mono" w:eastAsia="Roboto Mono" w:hAnsi="Roboto Mono"/>
@@ -28795,7 +29007,7 @@
               </w:rPr>
               <w:t xml:space="preserve"> • </w:t>
             </w:r>
-            <w:hyperlink r:id="rId134">
+            <w:hyperlink r:id="rId141">
               <w:r>
                 <w:rPr>
                   <w:rFonts w:ascii="Roboto Mono" w:cs="Roboto Mono" w:eastAsia="Roboto Mono" w:hAnsi="Roboto Mono"/>
@@ -28816,7 +29028,7 @@
               </w:rPr>
               <w:t xml:space="preserve"> • </w:t>
             </w:r>
-            <w:hyperlink r:id="rId135">
+            <w:hyperlink r:id="rId142">
               <w:r>
                 <w:rPr>
                   <w:rFonts w:ascii="Roboto Mono" w:cs="Roboto Mono" w:eastAsia="Roboto Mono" w:hAnsi="Roboto Mono"/>
@@ -28842,7 +29054,7 @@
       <w:pPr>
         <w:numPr>
           <w:ilvl w:val="0"/>
-          <w:numId w:val="18"/>
+          <w:numId w:val="1"/>
         </w:numPr>
         <w:shd w:fill="auto" w:val="clear"/>
         <w:spacing w:after="0" w:afterAutospacing="0" w:before="360" w:lineRule="auto"/>
@@ -28866,7 +29078,7 @@
       <w:pPr>
         <w:numPr>
           <w:ilvl w:val="1"/>
-          <w:numId w:val="18"/>
+          <w:numId w:val="1"/>
         </w:numPr>
         <w:spacing w:after="0" w:afterAutospacing="0" w:lineRule="auto"/>
         <w:ind w:left="1440" w:hanging="360"/>
@@ -28874,7 +29086,7 @@
           <w:u w:val="none"/>
         </w:rPr>
       </w:pPr>
-      <w:hyperlink r:id="rId136">
+      <w:hyperlink r:id="rId143">
         <w:r>
           <w:rPr>
             <w:color w:val="1155cc"/>
@@ -28884,7 +29096,7 @@
           <w:t xml:space="preserve">Open Interactive 27-File Codebase Workbench &amp; Live Terminal Runner (</w:t>
         </w:r>
       </w:hyperlink>
-      <w:hyperlink r:id="rId137">
+      <w:hyperlink r:id="rId144">
         <w:r>
           <w:rPr>
             <w:rFonts w:ascii="Roboto Mono" w:cs="Roboto Mono" w:eastAsia="Roboto Mono" w:hAnsi="Roboto Mono"/>
@@ -28895,7 +29107,7 @@
           <w:t xml:space="preserve">#blog-e2e-pattern-execution-and-codebase-workbench</w:t>
         </w:r>
       </w:hyperlink>
-      <w:hyperlink r:id="rId138">
+      <w:hyperlink r:id="rId145">
         <w:r>
           <w:rPr>
             <w:color w:val="1155cc"/>
@@ -28915,7 +29127,7 @@
       <w:pPr>
         <w:numPr>
           <w:ilvl w:val="1"/>
-          <w:numId w:val="18"/>
+          <w:numId w:val="1"/>
         </w:numPr>
         <w:spacing w:after="0" w:afterAutospacing="0" w:lineRule="auto"/>
         <w:ind w:left="1440" w:hanging="360"/>
@@ -28923,7 +29135,7 @@
           <w:u w:val="none"/>
         </w:rPr>
       </w:pPr>
-      <w:hyperlink r:id="rId139">
+      <w:hyperlink r:id="rId146">
         <w:r>
           <w:rPr>
             <w:color w:val="1155cc"/>
@@ -28933,7 +29145,7 @@
           <w:t xml:space="preserve">Pattern A 1-Click Terraform (</w:t>
         </w:r>
       </w:hyperlink>
-      <w:hyperlink r:id="rId140">
+      <w:hyperlink r:id="rId147">
         <w:r>
           <w:rPr>
             <w:rFonts w:ascii="Roboto Mono" w:cs="Roboto Mono" w:eastAsia="Roboto Mono" w:hAnsi="Roboto Mono"/>
@@ -28944,7 +29156,7 @@
           <w:t xml:space="preserve">workstream-2-pattern-a-pooled/2.6-terraform-starter/deploy_1click.sh</w:t>
         </w:r>
       </w:hyperlink>
-      <w:hyperlink r:id="rId141">
+      <w:hyperlink r:id="rId148">
         <w:r>
           <w:rPr>
             <w:color w:val="1155cc"/>
@@ -28964,7 +29176,7 @@
       <w:pPr>
         <w:numPr>
           <w:ilvl w:val="1"/>
-          <w:numId w:val="18"/>
+          <w:numId w:val="1"/>
         </w:numPr>
         <w:spacing w:after="0" w:afterAutospacing="0" w:lineRule="auto"/>
         <w:ind w:left="1440" w:hanging="360"/>
@@ -28972,7 +29184,7 @@
           <w:u w:val="none"/>
         </w:rPr>
       </w:pPr>
-      <w:hyperlink r:id="rId142">
+      <w:hyperlink r:id="rId149">
         <w:r>
           <w:rPr>
             <w:color w:val="1155cc"/>
@@ -28982,7 +29194,7 @@
           <w:t xml:space="preserve">Pattern B 1-Click Terraform (</w:t>
         </w:r>
       </w:hyperlink>
-      <w:hyperlink r:id="rId143">
+      <w:hyperlink r:id="rId150">
         <w:r>
           <w:rPr>
             <w:rFonts w:ascii="Roboto Mono" w:cs="Roboto Mono" w:eastAsia="Roboto Mono" w:hAnsi="Roboto Mono"/>
@@ -28993,7 +29205,7 @@
           <w:t xml:space="preserve">workstream-3-pattern-b-siloed/3.6-terraform-silo-blueprint/deploy_1click.sh</w:t>
         </w:r>
       </w:hyperlink>
-      <w:hyperlink r:id="rId144">
+      <w:hyperlink r:id="rId151">
         <w:r>
           <w:rPr>
             <w:color w:val="1155cc"/>
@@ -29013,7 +29225,7 @@
       <w:pPr>
         <w:numPr>
           <w:ilvl w:val="1"/>
-          <w:numId w:val="18"/>
+          <w:numId w:val="1"/>
         </w:numPr>
         <w:spacing w:after="0" w:afterAutospacing="0" w:lineRule="auto"/>
         <w:ind w:left="1440" w:hanging="360"/>
@@ -29021,7 +29233,7 @@
           <w:u w:val="none"/>
         </w:rPr>
       </w:pPr>
-      <w:hyperlink r:id="rId145">
+      <w:hyperlink r:id="rId152">
         <w:r>
           <w:rPr>
             <w:color w:val="1155cc"/>
@@ -29031,7 +29243,7 @@
           <w:t xml:space="preserve">Pattern C 1-Click Terraform (</w:t>
         </w:r>
       </w:hyperlink>
-      <w:hyperlink r:id="rId146">
+      <w:hyperlink r:id="rId153">
         <w:r>
           <w:rPr>
             <w:rFonts w:ascii="Roboto Mono" w:cs="Roboto Mono" w:eastAsia="Roboto Mono" w:hAnsi="Roboto Mono"/>
@@ -29042,7 +29254,7 @@
           <w:t xml:space="preserve">workstream-4-pattern-c-hybrid/4.6-terraform-hybrid-psc-blueprint/deploy_1click.sh</w:t>
         </w:r>
       </w:hyperlink>
-      <w:hyperlink r:id="rId147">
+      <w:hyperlink r:id="rId154">
         <w:r>
           <w:rPr>
             <w:color w:val="1155cc"/>
@@ -29062,7 +29274,7 @@
       <w:pPr>
         <w:numPr>
           <w:ilvl w:val="1"/>
-          <w:numId w:val="18"/>
+          <w:numId w:val="1"/>
         </w:numPr>
         <w:spacing w:after="0" w:afterAutospacing="0" w:lineRule="auto"/>
         <w:ind w:left="1440" w:hanging="360"/>
@@ -29070,7 +29282,7 @@
           <w:u w:val="none"/>
         </w:rPr>
       </w:pPr>
-      <w:hyperlink r:id="rId148">
+      <w:hyperlink r:id="rId155">
         <w:r>
           <w:rPr>
             <w:color w:val="1155cc"/>
@@ -29080,7 +29292,7 @@
           <w:t xml:space="preserve">Live GCP &amp; AWS Cloud Verification Receipt (</w:t>
         </w:r>
       </w:hyperlink>
-      <w:hyperlink r:id="rId149">
+      <w:hyperlink r:id="rId156">
         <w:r>
           <w:rPr>
             <w:rFonts w:ascii="Roboto Mono" w:cs="Roboto Mono" w:eastAsia="Roboto Mono" w:hAnsi="Roboto Mono"/>
@@ -29091,7 +29303,7 @@
           <w:t xml:space="preserve">docs/cloud_console_verification_receipt.json</w:t>
         </w:r>
       </w:hyperlink>
-      <w:hyperlink r:id="rId150">
+      <w:hyperlink r:id="rId157">
         <w:r>
           <w:rPr>
             <w:color w:val="1155cc"/>
@@ -29111,7 +29323,7 @@
       <w:pPr>
         <w:numPr>
           <w:ilvl w:val="0"/>
-          <w:numId w:val="18"/>
+          <w:numId w:val="1"/>
         </w:numPr>
         <w:spacing w:after="0" w:afterAutospacing="0" w:lineRule="auto"/>
         <w:ind w:left="720" w:hanging="360"/>
@@ -29130,7 +29342,7 @@
       <w:pPr>
         <w:numPr>
           <w:ilvl w:val="1"/>
-          <w:numId w:val="18"/>
+          <w:numId w:val="1"/>
         </w:numPr>
         <w:spacing w:after="0" w:afterAutospacing="0" w:lineRule="auto"/>
         <w:ind w:left="1440" w:hanging="360"/>
@@ -29138,7 +29350,7 @@
           <w:u w:val="none"/>
         </w:rPr>
       </w:pPr>
-      <w:hyperlink r:id="rId151">
+      <w:hyperlink r:id="rId158">
         <w:r>
           <w:rPr>
             <w:color w:val="1155cc"/>
@@ -29158,7 +29370,7 @@
       <w:pPr>
         <w:numPr>
           <w:ilvl w:val="1"/>
-          <w:numId w:val="18"/>
+          <w:numId w:val="1"/>
         </w:numPr>
         <w:spacing w:after="0" w:afterAutospacing="0" w:lineRule="auto"/>
         <w:ind w:left="1440" w:hanging="360"/>
@@ -29166,7 +29378,7 @@
           <w:u w:val="none"/>
         </w:rPr>
       </w:pPr>
-      <w:hyperlink r:id="rId152">
+      <w:hyperlink r:id="rId159">
         <w:r>
           <w:rPr>
             <w:color w:val="1155cc"/>
@@ -29186,7 +29398,7 @@
       <w:pPr>
         <w:numPr>
           <w:ilvl w:val="1"/>
-          <w:numId w:val="18"/>
+          <w:numId w:val="1"/>
         </w:numPr>
         <w:spacing w:after="0" w:afterAutospacing="0" w:lineRule="auto"/>
         <w:ind w:left="1440" w:hanging="360"/>
@@ -29194,7 +29406,7 @@
           <w:u w:val="none"/>
         </w:rPr>
       </w:pPr>
-      <w:hyperlink r:id="rId153">
+      <w:hyperlink r:id="rId160">
         <w:r>
           <w:rPr>
             <w:color w:val="1155cc"/>
@@ -29214,7 +29426,7 @@
       <w:pPr>
         <w:numPr>
           <w:ilvl w:val="1"/>
-          <w:numId w:val="18"/>
+          <w:numId w:val="1"/>
         </w:numPr>
         <w:spacing w:after="0" w:afterAutospacing="0" w:lineRule="auto"/>
         <w:ind w:left="1440" w:hanging="360"/>
@@ -29222,7 +29434,7 @@
           <w:u w:val="none"/>
         </w:rPr>
       </w:pPr>
-      <w:hyperlink r:id="rId154">
+      <w:hyperlink r:id="rId161">
         <w:r>
           <w:rPr>
             <w:color w:val="1155cc"/>
@@ -29242,7 +29454,7 @@
       <w:pPr>
         <w:numPr>
           <w:ilvl w:val="0"/>
-          <w:numId w:val="18"/>
+          <w:numId w:val="1"/>
         </w:numPr>
         <w:spacing w:after="0" w:afterAutospacing="0" w:lineRule="auto"/>
         <w:ind w:left="720" w:hanging="360"/>
@@ -29261,7 +29473,7 @@
       <w:pPr>
         <w:numPr>
           <w:ilvl w:val="1"/>
-          <w:numId w:val="18"/>
+          <w:numId w:val="1"/>
         </w:numPr>
         <w:spacing w:after="0" w:afterAutospacing="0" w:lineRule="auto"/>
         <w:ind w:left="1440" w:hanging="360"/>
@@ -29269,7 +29481,7 @@
           <w:u w:val="none"/>
         </w:rPr>
       </w:pPr>
-      <w:hyperlink r:id="rId155">
+      <w:hyperlink r:id="rId162">
         <w:r>
           <w:rPr>
             <w:color w:val="1155cc"/>
@@ -29289,7 +29501,7 @@
       <w:pPr>
         <w:numPr>
           <w:ilvl w:val="1"/>
-          <w:numId w:val="18"/>
+          <w:numId w:val="1"/>
         </w:numPr>
         <w:spacing w:after="0" w:afterAutospacing="0" w:lineRule="auto"/>
         <w:ind w:left="1440" w:hanging="360"/>
@@ -29297,7 +29509,7 @@
           <w:u w:val="none"/>
         </w:rPr>
       </w:pPr>
-      <w:hyperlink r:id="rId156">
+      <w:hyperlink r:id="rId163">
         <w:r>
           <w:rPr>
             <w:color w:val="1155cc"/>
@@ -29317,7 +29529,7 @@
       <w:pPr>
         <w:numPr>
           <w:ilvl w:val="1"/>
-          <w:numId w:val="18"/>
+          <w:numId w:val="1"/>
         </w:numPr>
         <w:spacing w:after="0" w:afterAutospacing="0" w:lineRule="auto"/>
         <w:ind w:left="1440" w:hanging="360"/>
@@ -29325,7 +29537,7 @@
           <w:u w:val="none"/>
         </w:rPr>
       </w:pPr>
-      <w:hyperlink r:id="rId157">
+      <w:hyperlink r:id="rId164">
         <w:r>
           <w:rPr>
             <w:color w:val="1155cc"/>
@@ -29345,7 +29557,7 @@
       <w:pPr>
         <w:numPr>
           <w:ilvl w:val="1"/>
-          <w:numId w:val="18"/>
+          <w:numId w:val="1"/>
         </w:numPr>
         <w:spacing w:after="0" w:afterAutospacing="0" w:lineRule="auto"/>
         <w:ind w:left="1440" w:hanging="360"/>
@@ -29353,7 +29565,7 @@
           <w:u w:val="none"/>
         </w:rPr>
       </w:pPr>
-      <w:hyperlink r:id="rId158">
+      <w:hyperlink r:id="rId165">
         <w:r>
           <w:rPr>
             <w:color w:val="1155cc"/>
@@ -29363,7 +29575,7 @@
           <w:t xml:space="preserve">10 Third-Party SaaS × 3-Pattern Manual Testing Playbook (</w:t>
         </w:r>
       </w:hyperlink>
-      <w:hyperlink r:id="rId159">
+      <w:hyperlink r:id="rId166">
         <w:r>
           <w:rPr>
             <w:rFonts w:ascii="Roboto Mono" w:cs="Roboto Mono" w:eastAsia="Roboto Mono" w:hAnsi="Roboto Mono"/>
@@ -29374,7 +29586,7 @@
           <w:t xml:space="preserve">10-THIRD-PARTY-SAAS-3-PATTERN-MANUAL-TESTING-PLAYBOOK.md</w:t>
         </w:r>
       </w:hyperlink>
-      <w:hyperlink r:id="rId160">
+      <w:hyperlink r:id="rId167">
         <w:r>
           <w:rPr>
             <w:color w:val="1155cc"/>
@@ -29394,7 +29606,7 @@
       <w:pPr>
         <w:numPr>
           <w:ilvl w:val="0"/>
-          <w:numId w:val="18"/>
+          <w:numId w:val="1"/>
         </w:numPr>
         <w:spacing w:after="0" w:afterAutospacing="0" w:lineRule="auto"/>
         <w:ind w:left="720" w:hanging="360"/>
@@ -29413,7 +29625,7 @@
       <w:pPr>
         <w:numPr>
           <w:ilvl w:val="1"/>
-          <w:numId w:val="18"/>
+          <w:numId w:val="1"/>
         </w:numPr>
         <w:spacing w:after="0" w:afterAutospacing="0" w:lineRule="auto"/>
         <w:ind w:left="1440" w:hanging="360"/>
@@ -29421,17 +29633,104 @@
           <w:u w:val="none"/>
         </w:rPr>
       </w:pPr>
-      <w:hyperlink r:id="rId161">
+      <w:hyperlink r:id="rId168">
+        <w:r>
+          <w:rPr>
+            <w:rFonts w:ascii="Arial Unicode MS" w:cs="Arial Unicode MS" w:eastAsia="Arial Unicode MS" w:hAnsi="Arial Unicode MS"/>
+            <w:color w:val="1155cc"/>
+            <w:u w:val="single"/>
+            <w:rtl w:val="0"/>
+          </w:rPr>
+          <w:t xml:space="preserve">Open WS5 12-Slide Presentation in Google Slides ↗</w:t>
+        </w:r>
+      </w:hyperlink>
+      <w:r>
+        <w:rPr>
+          <w:rtl w:val="0"/>
+        </w:rPr>
+      </w:r>
+    </w:p>
+    <w:p>
+      <w:pPr>
+        <w:numPr>
+          <w:ilvl w:val="1"/>
+          <w:numId w:val="1"/>
+        </w:numPr>
+        <w:spacing w:after="0" w:afterAutospacing="0" w:lineRule="auto"/>
+        <w:ind w:left="1440" w:hanging="360"/>
+        <w:rPr>
+          <w:u w:val="none"/>
+        </w:rPr>
+      </w:pPr>
+      <w:hyperlink r:id="rId169">
+        <w:r>
+          <w:rPr>
+            <w:rFonts w:ascii="Arial Unicode MS" w:cs="Arial Unicode MS" w:eastAsia="Arial Unicode MS" w:hAnsi="Arial Unicode MS"/>
+            <w:color w:val="1155cc"/>
+            <w:u w:val="single"/>
+            <w:rtl w:val="0"/>
+          </w:rPr>
+          <w:t xml:space="preserve">Open Master 25-Slide Presentation in Google Slides ↗</w:t>
+        </w:r>
+      </w:hyperlink>
+      <w:r>
+        <w:rPr>
+          <w:rtl w:val="0"/>
+        </w:rPr>
+      </w:r>
+    </w:p>
+    <w:p>
+      <w:pPr>
+        <w:numPr>
+          <w:ilvl w:val="1"/>
+          <w:numId w:val="1"/>
+        </w:numPr>
+        <w:spacing w:after="0" w:afterAutospacing="0" w:lineRule="auto"/>
+        <w:ind w:left="1440" w:hanging="360"/>
+        <w:rPr>
+          <w:u w:val="none"/>
+        </w:rPr>
+      </w:pPr>
+      <w:hyperlink r:id="rId170">
+        <w:r>
+          <w:rPr>
+            <w:rFonts w:ascii="Arial Unicode MS" w:cs="Arial Unicode MS" w:eastAsia="Arial Unicode MS" w:hAnsi="Arial Unicode MS"/>
+            <w:color w:val="1155cc"/>
+            <w:u w:val="single"/>
+            <w:rtl w:val="0"/>
+          </w:rPr>
+          <w:t xml:space="preserve">Open WS5 GCP-Branded Document in Google Docs ↗</w:t>
+        </w:r>
+      </w:hyperlink>
+      <w:r>
+        <w:rPr>
+          <w:rtl w:val="0"/>
+        </w:rPr>
+      </w:r>
+    </w:p>
+    <w:p>
+      <w:pPr>
+        <w:numPr>
+          <w:ilvl w:val="1"/>
+          <w:numId w:val="1"/>
+        </w:numPr>
+        <w:spacing w:after="0" w:afterAutospacing="0" w:lineRule="auto"/>
+        <w:ind w:left="1440" w:hanging="360"/>
+        <w:rPr>
+          <w:u w:val="none"/>
+        </w:rPr>
+      </w:pPr>
+      <w:hyperlink r:id="rId171">
         <w:r>
           <w:rPr>
             <w:color w:val="1155cc"/>
             <w:u w:val="single"/>
             <w:rtl w:val="0"/>
           </w:rPr>
-          <w:t xml:space="preserve">Workstream 5 Editable Google Slides Deck (</w:t>
+          <w:t xml:space="preserve">Download Workstream 5 Editable Word Document (</w:t>
         </w:r>
       </w:hyperlink>
-      <w:hyperlink r:id="rId162">
+      <w:hyperlink r:id="rId172">
         <w:r>
           <w:rPr>
             <w:rFonts w:ascii="Roboto Mono" w:cs="Roboto Mono" w:eastAsia="Roboto Mono" w:hAnsi="Roboto Mono"/>
@@ -29439,10 +29738,10 @@
             <w:u w:val="single"/>
             <w:rtl w:val="0"/>
           </w:rPr>
-          <w:t xml:space="preserve">ws5-wrap-up-editable-slides.pptx</w:t>
+          <w:t xml:space="preserve">.docx</w:t>
         </w:r>
       </w:hyperlink>
-      <w:hyperlink r:id="rId163">
+      <w:hyperlink r:id="rId173">
         <w:r>
           <w:rPr>
             <w:color w:val="1155cc"/>
@@ -29462,25 +29761,25 @@
       <w:pPr>
         <w:numPr>
           <w:ilvl w:val="1"/>
-          <w:numId w:val="18"/>
+          <w:numId w:val="1"/>
         </w:numPr>
-        <w:spacing w:after="200" w:lineRule="auto"/>
+        <w:spacing w:after="0" w:afterAutospacing="0" w:lineRule="auto"/>
         <w:ind w:left="1440" w:hanging="360"/>
         <w:rPr>
           <w:u w:val="none"/>
         </w:rPr>
       </w:pPr>
-      <w:hyperlink r:id="rId164">
+      <w:hyperlink r:id="rId174">
         <w:r>
           <w:rPr>
             <w:color w:val="1155cc"/>
             <w:u w:val="single"/>
             <w:rtl w:val="0"/>
           </w:rPr>
-          <w:t xml:space="preserve">All-in-One 25-Slide Master Presentation (</w:t>
+          <w:t xml:space="preserve">Download Workstream 5 Canonical 12-Slide Presentation (</w:t>
         </w:r>
       </w:hyperlink>
-      <w:hyperlink r:id="rId165">
+      <w:hyperlink r:id="rId175">
         <w:r>
           <w:rPr>
             <w:rFonts w:ascii="Roboto Mono" w:cs="Roboto Mono" w:eastAsia="Roboto Mono" w:hAnsi="Roboto Mono"/>
@@ -29488,10 +29787,108 @@
             <w:u w:val="single"/>
             <w:rtl w:val="0"/>
           </w:rPr>
-          <w:t xml:space="preserve">geap-multi-tenancy-all-workstreams-editable-slides.pptx</w:t>
+          <w:t xml:space="preserve">.pptx</w:t>
         </w:r>
       </w:hyperlink>
-      <w:hyperlink r:id="rId166">
+      <w:hyperlink r:id="rId176">
+        <w:r>
+          <w:rPr>
+            <w:color w:val="1155cc"/>
+            <w:u w:val="single"/>
+            <w:rtl w:val="0"/>
+          </w:rPr>
+          <w:t xml:space="preserve">)</w:t>
+        </w:r>
+      </w:hyperlink>
+      <w:r>
+        <w:rPr>
+          <w:rtl w:val="0"/>
+        </w:rPr>
+      </w:r>
+    </w:p>
+    <w:p>
+      <w:pPr>
+        <w:numPr>
+          <w:ilvl w:val="1"/>
+          <w:numId w:val="1"/>
+        </w:numPr>
+        <w:spacing w:after="0" w:afterAutospacing="0" w:lineRule="auto"/>
+        <w:ind w:left="1440" w:hanging="360"/>
+        <w:rPr>
+          <w:u w:val="none"/>
+        </w:rPr>
+      </w:pPr>
+      <w:hyperlink r:id="rId177">
+        <w:r>
+          <w:rPr>
+            <w:color w:val="1155cc"/>
+            <w:u w:val="single"/>
+            <w:rtl w:val="0"/>
+          </w:rPr>
+          <w:t xml:space="preserve">Download Master 25-Slide Presentation (</w:t>
+        </w:r>
+      </w:hyperlink>
+      <w:hyperlink r:id="rId178">
+        <w:r>
+          <w:rPr>
+            <w:rFonts w:ascii="Roboto Mono" w:cs="Roboto Mono" w:eastAsia="Roboto Mono" w:hAnsi="Roboto Mono"/>
+            <w:color w:val="1155cc"/>
+            <w:u w:val="single"/>
+            <w:rtl w:val="0"/>
+          </w:rPr>
+          <w:t xml:space="preserve">.pptx</w:t>
+        </w:r>
+      </w:hyperlink>
+      <w:hyperlink r:id="rId179">
+        <w:r>
+          <w:rPr>
+            <w:color w:val="1155cc"/>
+            <w:u w:val="single"/>
+            <w:rtl w:val="0"/>
+          </w:rPr>
+          <w:t xml:space="preserve">)</w:t>
+        </w:r>
+      </w:hyperlink>
+      <w:r>
+        <w:rPr>
+          <w:rtl w:val="0"/>
+        </w:rPr>
+      </w:r>
+    </w:p>
+    <w:p>
+      <w:pPr>
+        <w:numPr>
+          <w:ilvl w:val="1"/>
+          <w:numId w:val="1"/>
+        </w:numPr>
+        <w:spacing w:after="200" w:lineRule="auto"/>
+        <w:ind w:left="1440" w:hanging="360"/>
+        <w:rPr>
+          <w:u w:val="none"/>
+        </w:rPr>
+      </w:pPr>
+      <w:hyperlink r:id="rId180">
+        <w:r>
+          <w:rPr>
+            <w:color w:val="1155cc"/>
+            <w:u w:val="single"/>
+            <w:rtl w:val="0"/>
+          </w:rPr>
+          <w:t xml:space="preserve">Figure 1 Draw.io Source (</w:t>
+        </w:r>
+      </w:hyperlink>
+      <w:hyperlink r:id="rId181">
+        <w:r>
+          <w:rPr>
+            <w:rFonts w:ascii="Roboto Mono" w:cs="Roboto Mono" w:eastAsia="Roboto Mono" w:hAnsi="Roboto Mono"/>
+            <w:color w:val="1155cc"/>
+            <w:u w:val="single"/>
+            <w:rtl w:val="0"/>
+          </w:rPr>
+          <w:t xml:space="preserve">ws5-decision-tree-and-agentic-triad.drawio</w:t>
+        </w:r>
+      </w:hyperlink>
+      <w:hyperlink r:id="rId182">
         <w:r>
           <w:rPr>
             <w:color w:val="1155cc"/>
@@ -30970,8 +31367,8 @@
   <w:abstractNum w:abstractNumId="14">
     <w:lvl w:ilvl="0">
       <w:start w:val="1"/>
-      <w:numFmt w:val="bullet"/>
-      <w:lvlText w:val="●"/>
+      <w:numFmt w:val="decimal"/>
+      <w:lvlText w:val="%1."/>
       <w:lvlJc w:val="left"/>
       <w:pPr>
         <w:ind w:left="720" w:hanging="360"/>
@@ -30982,8 +31379,8 @@
     </w:lvl>
     <w:lvl w:ilvl="1">
       <w:start w:val="1"/>
-      <w:numFmt w:val="bullet"/>
-      <w:lvlText w:val="○"/>
+      <w:numFmt w:val="lowerLetter"/>
+      <w:lvlText w:val="%2."/>
       <w:lvlJc w:val="left"/>
       <w:pPr>
         <w:ind w:left="1440" w:hanging="360"/>
@@ -30994,9 +31391,9 @@
     </w:lvl>
     <w:lvl w:ilvl="2">
       <w:start w:val="1"/>
-      <w:numFmt w:val="bullet"/>
-      <w:lvlText w:val="■"/>
-      <w:lvlJc w:val="left"/>
+      <w:numFmt w:val="lowerRoman"/>
+      <w:lvlText w:val="%3."/>
+      <w:lvlJc w:val="right"/>
       <w:pPr>
         <w:ind w:left="2160" w:hanging="360"/>
       </w:pPr>
@@ -31006,8 +31403,8 @@
     </w:lvl>
     <w:lvl w:ilvl="3">
       <w:start w:val="1"/>
-      <w:numFmt w:val="bullet"/>
-      <w:lvlText w:val="●"/>
+      <w:numFmt w:val="decimal"/>
+      <w:lvlText w:val="%4."/>
       <w:lvlJc w:val="left"/>
       <w:pPr>
         <w:ind w:left="2880" w:hanging="360"/>
@@ -31018,8 +31415,8 @@
     </w:lvl>
     <w:lvl w:ilvl="4">
       <w:start w:val="1"/>
-      <w:numFmt w:val="bullet"/>
-      <w:lvlText w:val="○"/>
+      <w:numFmt w:val="lowerLetter"/>
+      <w:lvlText w:val="%5."/>
       <w:lvlJc w:val="left"/>
       <w:pPr>
         <w:ind w:left="3600" w:hanging="360"/>
@@ -31030,9 +31427,9 @@
     </w:lvl>
     <w:lvl w:ilvl="5">
       <w:start w:val="1"/>
-      <w:numFmt w:val="bullet"/>
-      <w:lvlText w:val="■"/>
-      <w:lvlJc w:val="left"/>
+      <w:numFmt w:val="lowerRoman"/>
+      <w:lvlText w:val="%6."/>
+      <w:lvlJc w:val="right"/>
       <w:pPr>
         <w:ind w:left="4320" w:hanging="360"/>
       </w:pPr>
@@ -31042,8 +31439,8 @@
     </w:lvl>
     <w:lvl w:ilvl="6">
       <w:start w:val="1"/>
-      <w:numFmt w:val="bullet"/>
-      <w:lvlText w:val="●"/>
+      <w:numFmt w:val="decimal"/>
+      <w:lvlText w:val="%7."/>
       <w:lvlJc w:val="left"/>
       <w:pPr>
         <w:ind w:left="5040" w:hanging="360"/>
@@ -31054,8 +31451,8 @@
     </w:lvl>
     <w:lvl w:ilvl="7">
       <w:start w:val="1"/>
-      <w:numFmt w:val="bullet"/>
-      <w:lvlText w:val="○"/>
+      <w:numFmt w:val="lowerLetter"/>
+      <w:lvlText w:val="%8."/>
       <w:lvlJc w:val="left"/>
       <w:pPr>
         <w:ind w:left="5760" w:hanging="360"/>
@@ -31066,9 +31463,9 @@
     </w:lvl>
     <w:lvl w:ilvl="8">
       <w:start w:val="1"/>
-      <w:numFmt w:val="bullet"/>
-      <w:lvlText w:val="■"/>
-      <w:lvlJc w:val="left"/>
+      <w:numFmt w:val="lowerRoman"/>
+      <w:lvlText w:val="%9."/>
+      <w:lvlJc w:val="right"/>
       <w:pPr>
         <w:ind w:left="6480" w:hanging="360"/>
       </w:pPr>
@@ -31300,8 +31697,8 @@
   <w:abstractNum w:abstractNumId="17">
     <w:lvl w:ilvl="0">
       <w:start w:val="1"/>
-      <w:numFmt w:val="decimal"/>
-      <w:lvlText w:val="%1."/>
+      <w:numFmt w:val="bullet"/>
+      <w:lvlText w:val="●"/>
       <w:lvlJc w:val="left"/>
       <w:pPr>
         <w:ind w:left="720" w:hanging="360"/>
@@ -31312,8 +31709,8 @@
     </w:lvl>
     <w:lvl w:ilvl="1">
       <w:start w:val="1"/>
-      <w:numFmt w:val="lowerLetter"/>
-      <w:lvlText w:val="%2."/>
+      <w:numFmt w:val="bullet"/>
+      <w:lvlText w:val="○"/>
       <w:lvlJc w:val="left"/>
       <w:pPr>
         <w:ind w:left="1440" w:hanging="360"/>
@@ -31324,9 +31721,9 @@
     </w:lvl>
     <w:lvl w:ilvl="2">
       <w:start w:val="1"/>
-      <w:numFmt w:val="lowerRoman"/>
-      <w:lvlText w:val="%3."/>
-      <w:lvlJc w:val="right"/>
+      <w:numFmt w:val="bullet"/>
+      <w:lvlText w:val="■"/>
+      <w:lvlJc w:val="left"/>
       <w:pPr>
         <w:ind w:left="2160" w:hanging="360"/>
       </w:pPr>
@@ -31336,8 +31733,8 @@
     </w:lvl>
     <w:lvl w:ilvl="3">
       <w:start w:val="1"/>
-      <w:numFmt w:val="decimal"/>
-      <w:lvlText w:val="%4."/>
+      <w:numFmt w:val="bullet"/>
+      <w:lvlText w:val="●"/>
       <w:lvlJc w:val="left"/>
       <w:pPr>
         <w:ind w:left="2880" w:hanging="360"/>
@@ -31348,8 +31745,8 @@
     </w:lvl>
     <w:lvl w:ilvl="4">
       <w:start w:val="1"/>
-      <w:numFmt w:val="lowerLetter"/>
-      <w:lvlText w:val="%5."/>
+      <w:numFmt w:val="bullet"/>
+      <w:lvlText w:val="○"/>
       <w:lvlJc w:val="left"/>
       <w:pPr>
         <w:ind w:left="3600" w:hanging="360"/>
@@ -31360,9 +31757,9 @@
     </w:lvl>
     <w:lvl w:ilvl="5">
       <w:start w:val="1"/>
-      <w:numFmt w:val="lowerRoman"/>
-      <w:lvlText w:val="%6."/>
-      <w:lvlJc w:val="right"/>
+      <w:numFmt w:val="bullet"/>
+      <w:lvlText w:val="■"/>
+      <w:lvlJc w:val="left"/>
       <w:pPr>
         <w:ind w:left="4320" w:hanging="360"/>
       </w:pPr>
@@ -31372,8 +31769,8 @@
     </w:lvl>
     <w:lvl w:ilvl="6">
       <w:start w:val="1"/>
-      <w:numFmt w:val="decimal"/>
-      <w:lvlText w:val="%7."/>
+      <w:numFmt w:val="bullet"/>
+      <w:lvlText w:val="●"/>
       <w:lvlJc w:val="left"/>
       <w:pPr>
         <w:ind w:left="5040" w:hanging="360"/>
@@ -31384,8 +31781,8 @@
     </w:lvl>
     <w:lvl w:ilvl="7">
       <w:start w:val="1"/>
-      <w:numFmt w:val="lowerLetter"/>
-      <w:lvlText w:val="%8."/>
+      <w:numFmt w:val="bullet"/>
+      <w:lvlText w:val="○"/>
       <w:lvlJc w:val="left"/>
       <w:pPr>
         <w:ind w:left="5760" w:hanging="360"/>
@@ -31396,9 +31793,9 @@
     </w:lvl>
     <w:lvl w:ilvl="8">
       <w:start w:val="1"/>
-      <w:numFmt w:val="lowerRoman"/>
-      <w:lvlText w:val="%9."/>
-      <w:lvlJc w:val="right"/>
+      <w:numFmt w:val="bullet"/>
+      <w:lvlText w:val="■"/>
+      <w:lvlJc w:val="left"/>
       <w:pPr>
         <w:ind w:left="6480" w:hanging="360"/>
       </w:pPr>

</xml_diff>